<commit_message>
Update docs with final CI status
Co-Authored-By: Claude Opus 5.5 <noreply@anthropic.com>
</commit_message>
<xml_diff>
--- a/docs/Apostila-Claude-IA-Python.docx
+++ b/docs/Apostila-Claude-IA-Python.docx
@@ -17714,7 +17714,13 @@
       <w:bookmarkStart w:id="68" w:name="bongo_lang_text_68"/>
       <w:bookmarkEnd w:id="68"/>
       <w:r>
-        <w:t xml:space="preserve">7c97026 Add GitHub Actions CI workflow</w:t>
+        <w:t xml:space="preserve">(novo)  Update docs with final CI status   &lt;- o commit que traz esta versão da apostila</w:t>
+        <w:br/>
+        <w:t xml:space="preserve">cf6bc4b Exclude docs folder from ruff checks</w:t>
+        <w:br/>
+        <w:t xml:space="preserve">8144af5 Add GitHub Actions CI workflow</w:t>
+        <w:br/>
+        <w:t xml:space="preserve">9b73dcb Add project manual and study handbook in docs</w:t>
         <w:br/>
         <w:t xml:space="preserve">0f25fa5 Add README, license and update roadmap</w:t>
         <w:br/>
@@ -17933,7 +17939,7 @@
         <w:t xml:space="preserve">workflow</w:t>
       </w:r>
       <w:r>
-        <w:t xml:space="preserve"> scope". O GitHub exige uma permissão extra para enviar arquivos de CI, porque eles executam código nos servidores do GitHub. A solução foi enviar todo o resto e deixar o commit do CI para depois que o dono da conta conceder a permissão (</w:t>
+        <w:t xml:space="preserve"> scope". O GitHub exige uma permissão extra para enviar arquivos de CI, porque eles executam código nos servidores do GitHub. A solução foi enviar todo o resto, reorganizar os commits locais para que o do CI ficasse por último, e enviá-lo depois que o dono da conta concedeu a permissão no navegador (</w:t>
       </w:r>
       <w:r>
         <w:rPr>
@@ -18015,56 +18021,51 @@
       </w:r>
     </w:p>
     <w:p>
-      <w:pPr>
-        <w:pStyle w:val="Heading3"/>
-      </w:pPr>
-      <w:r>
-        <w:t xml:space="preserve">20.6 README e licença</w:t>
-      </w:r>
-    </w:p>
-    <w:p>
-      <w:pPr/>
-      <w:r>
-        <w:t xml:space="preserve">O </w:t>
-      </w:r>
-      <w:r>
-        <w:rPr>
-          <w:b/>
-        </w:rPr>
-        <w:t xml:space="preserve">README</w:t>
-      </w:r>
-      <w:r>
-        <w:t xml:space="preserve"> é a porta de entrada: o que o projeto faz (com um exemplo de saída), como instalar, como rodar, como testar, a estrutura e as melhorias futuras. A </w:t>
-      </w:r>
-      <w:r>
-        <w:rPr>
-          <w:b/>
-        </w:rPr>
-        <w:t xml:space="preserve">licença</w:t>
-      </w:r>
-      <w:r>
-        <w:t xml:space="preserve"> (MIT, no Pokedex) diz o que outras pessoas podem fazer com o código; sem licença, legalmente ninguém pode reutilizá-lo.</w:t>
-      </w:r>
-    </w:p>
-    <w:p>
-      <w:pPr/>
-      <w:r>
-        <w:rPr>
-          <w:b/>
-        </w:rPr>
-        <w:t xml:space="preserve">Na prática do mercado:</w:t>
-      </w:r>
-      <w:r>
-        <w:t xml:space="preserve"> o perfil do GitHub é o currículo técnico de quem está começando. Recrutadores olham, nesta ordem: README, selo de CI, pasta de testes, histórico de commits e, só então, o código.</w:t>
-      </w:r>
-    </w:p>
-    <w:p>
-      <w:pPr/>
-      <w:r>
-        <w:rPr>
-          <w:b/>
-        </w:rPr>
-        <w:t xml:space="preserve">Teste-se:</w:t>
+      <w:pPr/>
+      <w:r>
+        <w:rPr>
+          <w:b/>
+        </w:rPr>
+        <w:t xml:space="preserve">O CI pegou um erro de verdade neste projeto.</w:t>
+      </w:r>
+      <w:r>
+        <w:t xml:space="preserve"> A primeira execução falhou no Ubuntu (e o Windows foi cancelado em seguida). O log mostrava </w:t>
+      </w:r>
+      <w:r>
+        <w:rPr>
+          <w:rStyle w:val="CodeChar"/>
+        </w:rPr>
+        <w:t xml:space="preserve">1 file would be reformatted</w:t>
+      </w:r>
+      <w:r>
+        <w:t xml:space="preserve">: o </w:t>
+      </w:r>
+      <w:r>
+        <w:rPr>
+          <w:rStyle w:val="CodeChar"/>
+        </w:rPr>
+        <w:t xml:space="preserve">ruff format --check</w:t>
+      </w:r>
+      <w:r>
+        <w:t xml:space="preserve"> passou a analisar também os blocos de código Python </w:t>
+      </w:r>
+      <w:r>
+        <w:rPr>
+          <w:i/>
+        </w:rPr>
+        <w:t xml:space="preserve">dentro dos arquivos Markdown</w:t>
+      </w:r>
+      <w:r>
+        <w:t xml:space="preserve"> desta apostila, que acabara de ser adicionada em </w:t>
+      </w:r>
+      <w:r>
+        <w:rPr>
+          <w:rStyle w:val="CodeChar"/>
+        </w:rPr>
+        <w:t xml:space="preserve">docs/</w:t>
+      </w:r>
+      <w:r>
+        <w:t xml:space="preserve">. A verificação local não tinha sido repetida depois disso. O caminho seguido foi o do Módulo 6:</w:t>
       </w:r>
     </w:p>
     <w:p>
@@ -18076,25 +18077,22 @@
         </w:numPr>
       </w:pPr>
       <w:r>
-        <w:t xml:space="preserve">Qual a diferença entre </w:t>
-      </w:r>
-      <w:r>
-        <w:rPr>
-          <w:rStyle w:val="CodeChar"/>
-        </w:rPr>
-        <w:t xml:space="preserve">git add</w:t>
-      </w:r>
-      <w:r>
-        <w:t xml:space="preserve"> e </w:t>
-      </w:r>
-      <w:r>
-        <w:rPr>
-          <w:rStyle w:val="CodeChar"/>
-        </w:rPr>
-        <w:t xml:space="preserve">git commit</w:t>
-      </w:r>
-      <w:r>
-        <w:t xml:space="preserve">?</w:t>
+        <w:rPr>
+          <w:b/>
+        </w:rPr>
+        <w:t xml:space="preserve">Ler o log</w:t>
+      </w:r>
+      <w:r>
+        <w:t xml:space="preserve"> antes de mexer em qualquer coisa (</w:t>
+      </w:r>
+      <w:r>
+        <w:rPr>
+          <w:rStyle w:val="CodeChar"/>
+        </w:rPr>
+        <w:t xml:space="preserve">gh run view --log-failed</w:t>
+      </w:r>
+      <w:r>
+        <w:t xml:space="preserve">).</w:t>
       </w:r>
     </w:p>
     <w:p>
@@ -18106,7 +18104,22 @@
         </w:numPr>
       </w:pPr>
       <w:r>
-        <w:t xml:space="preserve">Reescreva no padrão do projeto: "consertei o bug do bom no menu".</w:t>
+        <w:rPr>
+          <w:b/>
+        </w:rPr>
+        <w:t xml:space="preserve">Reproduzir localmente:</w:t>
+      </w:r>
+      <w:r>
+        <w:t xml:space="preserve"> </w:t>
+      </w:r>
+      <w:r>
+        <w:rPr>
+          <w:rStyle w:val="CodeChar"/>
+        </w:rPr>
+        <w:t xml:space="preserve">ruff format --check .</w:t>
+      </w:r>
+      <w:r>
+        <w:t xml:space="preserve"> falhou do mesmo jeito.</w:t>
       </w:r>
     </w:p>
     <w:p>
@@ -18118,7 +18131,40 @@
         </w:numPr>
       </w:pPr>
       <w:r>
-        <w:t xml:space="preserve">Por que o GitHub exige uma permissão especial para arquivos de workflow?</w:t>
+        <w:rPr>
+          <w:b/>
+        </w:rPr>
+        <w:t xml:space="preserve">Corrigir a causa, não o sintoma:</w:t>
+      </w:r>
+      <w:r>
+        <w:t xml:space="preserve"> reformatar os trechos estragaria os contraexemplos de propósito; o certo era dizer ao ruff que </w:t>
+      </w:r>
+      <w:r>
+        <w:rPr>
+          <w:rStyle w:val="CodeChar"/>
+        </w:rPr>
+        <w:t xml:space="preserve">docs/</w:t>
+      </w:r>
+      <w:r>
+        <w:t xml:space="preserve"> não é código do projeto (</w:t>
+      </w:r>
+      <w:r>
+        <w:rPr>
+          <w:rStyle w:val="CodeChar"/>
+        </w:rPr>
+        <w:t xml:space="preserve">extend-exclude = ["docs"]</w:t>
+      </w:r>
+      <w:r>
+        <w:t xml:space="preserve"> no </w:t>
+      </w:r>
+      <w:r>
+        <w:rPr>
+          <w:rStyle w:val="CodeChar"/>
+        </w:rPr>
+        <w:t xml:space="preserve">pyproject.toml</w:t>
+      </w:r>
+      <w:r>
+        <w:t xml:space="preserve">).</w:t>
       </w:r>
     </w:p>
     <w:p>
@@ -18127,6 +18173,152 @@
         <w:numPr>
           <w:ilvl w:val="0"/>
           <w:numId w:val="32"/>
+        </w:numPr>
+      </w:pPr>
+      <w:r>
+        <w:rPr>
+          <w:b/>
+        </w:rPr>
+        <w:t xml:space="preserve">Verificar de novo:</w:t>
+      </w:r>
+      <w:r>
+        <w:t xml:space="preserve"> os mesmos comandos do CI localmente, depois o push, depois a nova execução: verde no Ubuntu e no Windows.</w:t>
+      </w:r>
+    </w:p>
+    <w:p>
+      <w:pPr/>
+      <w:r>
+        <w:rPr>
+          <w:b/>
+        </w:rPr>
+        <w:t xml:space="preserve">Contraexemplo:</w:t>
+      </w:r>
+      <w:r>
+        <w:t xml:space="preserve"> desligar a verificação que falhou ("tira o </w:t>
+      </w:r>
+      <w:r>
+        <w:rPr>
+          <w:rStyle w:val="CodeChar"/>
+        </w:rPr>
+        <w:t xml:space="preserve">ruff format</w:t>
+      </w:r>
+      <w:r>
+        <w:t xml:space="preserve"> do CI") para o selo ficar verde. O selo deixaria de significar alguma coisa.</w:t>
+      </w:r>
+    </w:p>
+    <w:p>
+      <w:pPr>
+        <w:pStyle w:val="Heading3"/>
+      </w:pPr>
+      <w:r>
+        <w:t xml:space="preserve">20.6 README e licença</w:t>
+      </w:r>
+    </w:p>
+    <w:p>
+      <w:pPr/>
+      <w:r>
+        <w:t xml:space="preserve">O </w:t>
+      </w:r>
+      <w:r>
+        <w:rPr>
+          <w:b/>
+        </w:rPr>
+        <w:t xml:space="preserve">README</w:t>
+      </w:r>
+      <w:r>
+        <w:t xml:space="preserve"> é a porta de entrada: o que o projeto faz (com um exemplo de saída), como instalar, como rodar, como testar, a estrutura e as melhorias futuras. A </w:t>
+      </w:r>
+      <w:r>
+        <w:rPr>
+          <w:b/>
+        </w:rPr>
+        <w:t xml:space="preserve">licença</w:t>
+      </w:r>
+      <w:r>
+        <w:t xml:space="preserve"> (MIT, no Pokedex) diz o que outras pessoas podem fazer com o código; sem licença, legalmente ninguém pode reutilizá-lo.</w:t>
+      </w:r>
+    </w:p>
+    <w:p>
+      <w:pPr/>
+      <w:r>
+        <w:rPr>
+          <w:b/>
+        </w:rPr>
+        <w:t xml:space="preserve">Na prática do mercado:</w:t>
+      </w:r>
+      <w:r>
+        <w:t xml:space="preserve"> o perfil do GitHub é o currículo técnico de quem está começando. Recrutadores olham, nesta ordem: README, selo de CI, pasta de testes, histórico de commits e, só então, o código.</w:t>
+      </w:r>
+    </w:p>
+    <w:p>
+      <w:pPr/>
+      <w:r>
+        <w:rPr>
+          <w:b/>
+        </w:rPr>
+        <w:t xml:space="preserve">Teste-se:</w:t>
+      </w:r>
+    </w:p>
+    <w:p>
+      <w:pPr>
+        <w:pStyle w:val="ListParagraph"/>
+        <w:numPr>
+          <w:ilvl w:val="0"/>
+          <w:numId w:val="33"/>
+        </w:numPr>
+      </w:pPr>
+      <w:r>
+        <w:t xml:space="preserve">Qual a diferença entre </w:t>
+      </w:r>
+      <w:r>
+        <w:rPr>
+          <w:rStyle w:val="CodeChar"/>
+        </w:rPr>
+        <w:t xml:space="preserve">git add</w:t>
+      </w:r>
+      <w:r>
+        <w:t xml:space="preserve"> e </w:t>
+      </w:r>
+      <w:r>
+        <w:rPr>
+          <w:rStyle w:val="CodeChar"/>
+        </w:rPr>
+        <w:t xml:space="preserve">git commit</w:t>
+      </w:r>
+      <w:r>
+        <w:t xml:space="preserve">?</w:t>
+      </w:r>
+    </w:p>
+    <w:p>
+      <w:pPr>
+        <w:pStyle w:val="ListParagraph"/>
+        <w:numPr>
+          <w:ilvl w:val="0"/>
+          <w:numId w:val="33"/>
+        </w:numPr>
+      </w:pPr>
+      <w:r>
+        <w:t xml:space="preserve">Reescreva no padrão do projeto: "consertei o bug do bom no menu".</w:t>
+      </w:r>
+    </w:p>
+    <w:p>
+      <w:pPr>
+        <w:pStyle w:val="ListParagraph"/>
+        <w:numPr>
+          <w:ilvl w:val="0"/>
+          <w:numId w:val="33"/>
+        </w:numPr>
+      </w:pPr>
+      <w:r>
+        <w:t xml:space="preserve">Por que o GitHub exige uma permissão especial para arquivos de workflow?</w:t>
+      </w:r>
+    </w:p>
+    <w:p>
+      <w:pPr>
+        <w:pStyle w:val="ListParagraph"/>
+        <w:numPr>
+          <w:ilvl w:val="0"/>
+          <w:numId w:val="33"/>
         </w:numPr>
       </w:pPr>
       <w:r>
@@ -21934,7 +22126,7 @@
         <w:pStyle w:val="ListParagraph"/>
         <w:numPr>
           <w:ilvl w:val="0"/>
-          <w:numId w:val="33"/>
+          <w:numId w:val="34"/>
         </w:numPr>
       </w:pPr>
       <w:r>
@@ -21957,258 +22149,6 @@
       </w:r>
       <w:r>
         <w:t xml:space="preserve"> muda.</w:t>
-      </w:r>
-    </w:p>
-    <w:p>
-      <w:pPr>
-        <w:pStyle w:val="ListParagraph"/>
-        <w:numPr>
-          <w:ilvl w:val="0"/>
-          <w:numId w:val="33"/>
-        </w:numPr>
-      </w:pPr>
-      <w:r>
-        <w:t xml:space="preserve">☐ </w:t>
-      </w:r>
-      <w:r>
-        <w:rPr>
-          <w:b/>
-        </w:rPr>
-        <w:t xml:space="preserve">D2. Opção </w:t>
-      </w:r>
-      <w:r>
-        <w:rPr>
-          <w:rStyle w:val="CodeChar"/>
-          <w:b/>
-        </w:rPr>
-        <w:t xml:space="preserve">--json</w:t>
-      </w:r>
-      <w:r>
-        <w:rPr>
-          <w:b/>
-        </w:rPr>
-        <w:t xml:space="preserve">:</w:t>
-      </w:r>
-      <w:r>
-        <w:t xml:space="preserve"> </w:t>
-      </w:r>
-      <w:r>
-        <w:rPr>
-          <w:rStyle w:val="CodeChar"/>
-        </w:rPr>
-        <w:t xml:space="preserve">pokedex search pikachu --json</w:t>
-      </w:r>
-      <w:r>
-        <w:t xml:space="preserve"> imprime os dados como JSON. Dica: </w:t>
-      </w:r>
-      <w:r>
-        <w:rPr>
-          <w:rStyle w:val="CodeChar"/>
-        </w:rPr>
-        <w:t xml:space="preserve">dataclasses.asdict</w:t>
-      </w:r>
-      <w:r>
-        <w:t xml:space="preserve"> e </w:t>
-      </w:r>
-      <w:r>
-        <w:rPr>
-          <w:rStyle w:val="CodeChar"/>
-        </w:rPr>
-        <w:t xml:space="preserve">json.dumps</w:t>
-      </w:r>
-      <w:r>
-        <w:t xml:space="preserve">; só </w:t>
-      </w:r>
-      <w:r>
-        <w:rPr>
-          <w:rStyle w:val="CodeChar"/>
-        </w:rPr>
-        <w:t xml:space="preserve">main.py</w:t>
-      </w:r>
-      <w:r>
-        <w:t xml:space="preserve"> muda.</w:t>
-      </w:r>
-    </w:p>
-    <w:p>
-      <w:pPr>
-        <w:pStyle w:val="ListParagraph"/>
-        <w:numPr>
-          <w:ilvl w:val="0"/>
-          <w:numId w:val="33"/>
-        </w:numPr>
-      </w:pPr>
-      <w:r>
-        <w:t xml:space="preserve">☐ </w:t>
-      </w:r>
-      <w:r>
-        <w:rPr>
-          <w:b/>
-        </w:rPr>
-        <w:t xml:space="preserve">D3. Ver detalhes a partir da lista:</w:t>
-      </w:r>
-      <w:r>
-        <w:t xml:space="preserve"> na paginação, digitar um nome mostra a ficha. Dica: um novo ramo no </w:t>
-      </w:r>
-      <w:r>
-        <w:rPr>
-          <w:rStyle w:val="CodeChar"/>
-        </w:rPr>
-        <w:t xml:space="preserve">browse</w:t>
-      </w:r>
-      <w:r>
-        <w:t xml:space="preserve">, reaproveitando </w:t>
-      </w:r>
-      <w:r>
-        <w:rPr>
-          <w:rStyle w:val="CodeChar"/>
-        </w:rPr>
-        <w:t xml:space="preserve">get_pokemon</w:t>
-      </w:r>
-      <w:r>
-        <w:t xml:space="preserve">.</w:t>
-      </w:r>
-    </w:p>
-    <w:p>
-      <w:pPr>
-        <w:pStyle w:val="ListParagraph"/>
-        <w:numPr>
-          <w:ilvl w:val="0"/>
-          <w:numId w:val="33"/>
-        </w:numPr>
-      </w:pPr>
-      <w:r>
-        <w:t xml:space="preserve">☐ </w:t>
-      </w:r>
-      <w:r>
-        <w:rPr>
-          <w:b/>
-        </w:rPr>
-        <w:t xml:space="preserve">D4. Retentativas:</w:t>
-      </w:r>
-      <w:r>
-        <w:t xml:space="preserve"> tentar de novo até 3 vezes em 429 e 503, com espera crescente. Dica: </w:t>
-      </w:r>
-      <w:r>
-        <w:rPr>
-          <w:rStyle w:val="CodeChar"/>
-        </w:rPr>
-        <w:t xml:space="preserve">urllib3.util.Retry</w:t>
-      </w:r>
-      <w:r>
-        <w:t xml:space="preserve"> montado na </w:t>
-      </w:r>
-      <w:r>
-        <w:rPr>
-          <w:rStyle w:val="CodeChar"/>
-        </w:rPr>
-        <w:t xml:space="preserve">Session</w:t>
-      </w:r>
-      <w:r>
-        <w:t xml:space="preserve">; teste com </w:t>
-      </w:r>
-      <w:r>
-        <w:rPr>
-          <w:rStyle w:val="CodeChar"/>
-        </w:rPr>
-        <w:t xml:space="preserve">side_effect</w:t>
-      </w:r>
-      <w:r>
-        <w:t xml:space="preserve"> em lista.</w:t>
-      </w:r>
-    </w:p>
-    <w:p>
-      <w:pPr>
-        <w:pStyle w:val="ListParagraph"/>
-        <w:numPr>
-          <w:ilvl w:val="0"/>
-          <w:numId w:val="33"/>
-        </w:numPr>
-      </w:pPr>
-      <w:r>
-        <w:t xml:space="preserve">☐ </w:t>
-      </w:r>
-      <w:r>
-        <w:rPr>
-          <w:b/>
-        </w:rPr>
-        <w:t xml:space="preserve">D5. Cache em disco com SQLite:</w:t>
-      </w:r>
-      <w:r>
-        <w:t xml:space="preserve"> guardar os Pokémon entre execuções. Dica: crie uma classe com a mesma interface </w:t>
-      </w:r>
-      <w:r>
-        <w:rPr>
-          <w:rStyle w:val="CodeChar"/>
-        </w:rPr>
-        <w:t xml:space="preserve">PokemonSource</w:t>
-      </w:r>
-      <w:r>
-        <w:t xml:space="preserve"> que envolve o cliente real (padrão decorator); o menu não muda.</w:t>
-      </w:r>
-    </w:p>
-    <w:p>
-      <w:pPr>
-        <w:pStyle w:val="ListParagraph"/>
-        <w:numPr>
-          <w:ilvl w:val="0"/>
-          <w:numId w:val="33"/>
-        </w:numPr>
-      </w:pPr>
-      <w:r>
-        <w:t xml:space="preserve">☐ </w:t>
-      </w:r>
-      <w:r>
-        <w:rPr>
-          <w:b/>
-        </w:rPr>
-        <w:t xml:space="preserve">D6. API web com FastAPI:</w:t>
-      </w:r>
-      <w:r>
-        <w:t xml:space="preserve"> </w:t>
-      </w:r>
-      <w:r>
-        <w:rPr>
-          <w:rStyle w:val="CodeChar"/>
-        </w:rPr>
-        <w:t xml:space="preserve">GET /pokemon/{name}</w:t>
-      </w:r>
-      <w:r>
-        <w:t xml:space="preserve"> devolvendo JSON e 404 quando não existe. Dica: reaproveite </w:t>
-      </w:r>
-      <w:r>
-        <w:rPr>
-          <w:rStyle w:val="CodeChar"/>
-        </w:rPr>
-        <w:t xml:space="preserve">models</w:t>
-      </w:r>
-      <w:r>
-        <w:t xml:space="preserve"> e </w:t>
-      </w:r>
-      <w:r>
-        <w:rPr>
-          <w:rStyle w:val="CodeChar"/>
-        </w:rPr>
-        <w:t xml:space="preserve">services</w:t>
-      </w:r>
-      <w:r>
-        <w:t xml:space="preserve"> sem alterá-los; troque </w:t>
-      </w:r>
-      <w:r>
-        <w:rPr>
-          <w:rStyle w:val="CodeChar"/>
-        </w:rPr>
-        <w:t xml:space="preserve">cli</w:t>
-      </w:r>
-      <w:r>
-        <w:t xml:space="preserve"> por rotas. Este é o passo natural para um portfólio de backend.</w:t>
-      </w:r>
-    </w:p>
-    <w:p>
-      <w:pPr>
-        <w:pStyle w:val="Heading3"/>
-      </w:pPr>
-      <w:r>
-        <w:t xml:space="preserve">Desafios sobre IA</w:t>
       </w:r>
     </w:p>
     <w:p>
@@ -22226,19 +22166,59 @@
         <w:rPr>
           <w:b/>
         </w:rPr>
-        <w:t xml:space="preserve">I1.</w:t>
-      </w:r>
-      <w:r>
-        <w:t xml:space="preserve"> Peça ao Claude para explicar </w:t>
-      </w:r>
-      <w:r>
-        <w:rPr>
-          <w:rStyle w:val="CodeChar"/>
-        </w:rPr>
-        <w:t xml:space="preserve">PokedexApp.browse</w:t>
-      </w:r>
-      <w:r>
-        <w:t xml:space="preserve"> linha a linha e confira cada afirmação rodando o código.</w:t>
+        <w:t xml:space="preserve">D2. Opção </w:t>
+      </w:r>
+      <w:r>
+        <w:rPr>
+          <w:rStyle w:val="CodeChar"/>
+          <w:b/>
+        </w:rPr>
+        <w:t xml:space="preserve">--json</w:t>
+      </w:r>
+      <w:r>
+        <w:rPr>
+          <w:b/>
+        </w:rPr>
+        <w:t xml:space="preserve">:</w:t>
+      </w:r>
+      <w:r>
+        <w:t xml:space="preserve"> </w:t>
+      </w:r>
+      <w:r>
+        <w:rPr>
+          <w:rStyle w:val="CodeChar"/>
+        </w:rPr>
+        <w:t xml:space="preserve">pokedex search pikachu --json</w:t>
+      </w:r>
+      <w:r>
+        <w:t xml:space="preserve"> imprime os dados como JSON. Dica: </w:t>
+      </w:r>
+      <w:r>
+        <w:rPr>
+          <w:rStyle w:val="CodeChar"/>
+        </w:rPr>
+        <w:t xml:space="preserve">dataclasses.asdict</w:t>
+      </w:r>
+      <w:r>
+        <w:t xml:space="preserve"> e </w:t>
+      </w:r>
+      <w:r>
+        <w:rPr>
+          <w:rStyle w:val="CodeChar"/>
+        </w:rPr>
+        <w:t xml:space="preserve">json.dumps</w:t>
+      </w:r>
+      <w:r>
+        <w:t xml:space="preserve">; só </w:t>
+      </w:r>
+      <w:r>
+        <w:rPr>
+          <w:rStyle w:val="CodeChar"/>
+        </w:rPr>
+        <w:t xml:space="preserve">main.py</w:t>
+      </w:r>
+      <w:r>
+        <w:t xml:space="preserve"> muda.</w:t>
       </w:r>
     </w:p>
     <w:p>
@@ -22256,10 +22236,28 @@
         <w:rPr>
           <w:b/>
         </w:rPr>
-        <w:t xml:space="preserve">I2.</w:t>
-      </w:r>
-      <w:r>
-        <w:t xml:space="preserve"> Escreva um prompt ruim e um bom para o desafio D2 e compare os resultados.</w:t>
+        <w:t xml:space="preserve">D3. Ver detalhes a partir da lista:</w:t>
+      </w:r>
+      <w:r>
+        <w:t xml:space="preserve"> na paginação, digitar um nome mostra a ficha. Dica: um novo ramo no </w:t>
+      </w:r>
+      <w:r>
+        <w:rPr>
+          <w:rStyle w:val="CodeChar"/>
+        </w:rPr>
+        <w:t xml:space="preserve">browse</w:t>
+      </w:r>
+      <w:r>
+        <w:t xml:space="preserve">, reaproveitando </w:t>
+      </w:r>
+      <w:r>
+        <w:rPr>
+          <w:rStyle w:val="CodeChar"/>
+        </w:rPr>
+        <w:t xml:space="preserve">get_pokemon</w:t>
+      </w:r>
+      <w:r>
+        <w:t xml:space="preserve">.</w:t>
       </w:r>
     </w:p>
     <w:p>
@@ -22277,19 +22275,124 @@
         <w:rPr>
           <w:b/>
         </w:rPr>
-        <w:t xml:space="preserve">I3.</w:t>
-      </w:r>
-      <w:r>
-        <w:t xml:space="preserve"> Acrescente ao </w:t>
-      </w:r>
-      <w:r>
-        <w:rPr>
-          <w:rStyle w:val="CodeChar"/>
-        </w:rPr>
-        <w:t xml:space="preserve">CLAUDE.md</w:t>
-      </w:r>
-      <w:r>
-        <w:t xml:space="preserve"> uma regra nova com o motivo, e observe se o comportamento muda.</w:t>
+        <w:t xml:space="preserve">D4. Retentativas:</w:t>
+      </w:r>
+      <w:r>
+        <w:t xml:space="preserve"> tentar de novo até 3 vezes em 429 e 503, com espera crescente. Dica: </w:t>
+      </w:r>
+      <w:r>
+        <w:rPr>
+          <w:rStyle w:val="CodeChar"/>
+        </w:rPr>
+        <w:t xml:space="preserve">urllib3.util.Retry</w:t>
+      </w:r>
+      <w:r>
+        <w:t xml:space="preserve"> montado na </w:t>
+      </w:r>
+      <w:r>
+        <w:rPr>
+          <w:rStyle w:val="CodeChar"/>
+        </w:rPr>
+        <w:t xml:space="preserve">Session</w:t>
+      </w:r>
+      <w:r>
+        <w:t xml:space="preserve">; teste com </w:t>
+      </w:r>
+      <w:r>
+        <w:rPr>
+          <w:rStyle w:val="CodeChar"/>
+        </w:rPr>
+        <w:t xml:space="preserve">side_effect</w:t>
+      </w:r>
+      <w:r>
+        <w:t xml:space="preserve"> em lista.</w:t>
+      </w:r>
+    </w:p>
+    <w:p>
+      <w:pPr>
+        <w:pStyle w:val="ListParagraph"/>
+        <w:numPr>
+          <w:ilvl w:val="0"/>
+          <w:numId w:val="34"/>
+        </w:numPr>
+      </w:pPr>
+      <w:r>
+        <w:t xml:space="preserve">☐ </w:t>
+      </w:r>
+      <w:r>
+        <w:rPr>
+          <w:b/>
+        </w:rPr>
+        <w:t xml:space="preserve">D5. Cache em disco com SQLite:</w:t>
+      </w:r>
+      <w:r>
+        <w:t xml:space="preserve"> guardar os Pokémon entre execuções. Dica: crie uma classe com a mesma interface </w:t>
+      </w:r>
+      <w:r>
+        <w:rPr>
+          <w:rStyle w:val="CodeChar"/>
+        </w:rPr>
+        <w:t xml:space="preserve">PokemonSource</w:t>
+      </w:r>
+      <w:r>
+        <w:t xml:space="preserve"> que envolve o cliente real (padrão decorator); o menu não muda.</w:t>
+      </w:r>
+    </w:p>
+    <w:p>
+      <w:pPr>
+        <w:pStyle w:val="ListParagraph"/>
+        <w:numPr>
+          <w:ilvl w:val="0"/>
+          <w:numId w:val="34"/>
+        </w:numPr>
+      </w:pPr>
+      <w:r>
+        <w:t xml:space="preserve">☐ </w:t>
+      </w:r>
+      <w:r>
+        <w:rPr>
+          <w:b/>
+        </w:rPr>
+        <w:t xml:space="preserve">D6. API web com FastAPI:</w:t>
+      </w:r>
+      <w:r>
+        <w:t xml:space="preserve"> </w:t>
+      </w:r>
+      <w:r>
+        <w:rPr>
+          <w:rStyle w:val="CodeChar"/>
+        </w:rPr>
+        <w:t xml:space="preserve">GET /pokemon/{name}</w:t>
+      </w:r>
+      <w:r>
+        <w:t xml:space="preserve"> devolvendo JSON e 404 quando não existe. Dica: reaproveite </w:t>
+      </w:r>
+      <w:r>
+        <w:rPr>
+          <w:rStyle w:val="CodeChar"/>
+        </w:rPr>
+        <w:t xml:space="preserve">models</w:t>
+      </w:r>
+      <w:r>
+        <w:t xml:space="preserve"> e </w:t>
+      </w:r>
+      <w:r>
+        <w:rPr>
+          <w:rStyle w:val="CodeChar"/>
+        </w:rPr>
+        <w:t xml:space="preserve">services</w:t>
+      </w:r>
+      <w:r>
+        <w:t xml:space="preserve"> sem alterá-los; troque </w:t>
+      </w:r>
+      <w:r>
+        <w:rPr>
+          <w:rStyle w:val="CodeChar"/>
+        </w:rPr>
+        <w:t xml:space="preserve">cli</w:t>
+      </w:r>
+      <w:r>
+        <w:t xml:space="preserve"> por rotas. Este é o passo natural para um portfólio de backend.</w:t>
       </w:r>
     </w:p>
     <w:p>
@@ -22297,16 +22400,7 @@
         <w:pStyle w:val="Heading3"/>
       </w:pPr>
       <w:r>
-        <w:t xml:space="preserve">Gabarito</w:t>
-      </w:r>
-    </w:p>
-    <w:p>
-      <w:pPr/>
-      <w:r>
-        <w:rPr>
-          <w:b/>
-        </w:rPr>
-        <w:t xml:space="preserve">Exercícios E1 a E6</w:t>
+        <w:t xml:space="preserve">Desafios sobre IA</w:t>
       </w:r>
     </w:p>
     <w:p>
@@ -22318,58 +22412,25 @@
         </w:numPr>
       </w:pPr>
       <w:r>
-        <w:rPr>
-          <w:b/>
-        </w:rPr>
-        <w:t xml:space="preserve">E1:</w:t>
-      </w:r>
-      <w:r>
-        <w:t xml:space="preserve"> sem </w:t>
-      </w:r>
-      <w:r>
-        <w:rPr>
-          <w:rStyle w:val="CodeChar"/>
-        </w:rPr>
-        <w:t xml:space="preserve">timeout</w:t>
-      </w:r>
-      <w:r>
-        <w:t xml:space="preserve"> (pode congelar para sempre), sem validar </w:t>
-      </w:r>
-      <w:r>
-        <w:rPr>
-          <w:rStyle w:val="CodeChar"/>
-        </w:rPr>
-        <w:t xml:space="preserve">name</w:t>
-      </w:r>
-      <w:r>
-        <w:t xml:space="preserve"> (</w:t>
-      </w:r>
-      <w:r>
-        <w:rPr>
-          <w:rStyle w:val="CodeChar"/>
-        </w:rPr>
-        <w:t xml:space="preserve">../</w:t>
-      </w:r>
-      <w:r>
-        <w:t xml:space="preserve"> muda a URL), sem checar o status (um 404 vira </w:t>
-      </w:r>
-      <w:r>
-        <w:rPr>
-          <w:rStyle w:val="CodeChar"/>
-        </w:rPr>
-        <w:t xml:space="preserve">KeyError</w:t>
-      </w:r>
-      <w:r>
-        <w:t xml:space="preserve"> depois) e tudo misturado numa função. Correção: o </w:t>
-      </w:r>
-      <w:r>
-        <w:rPr>
-          <w:rStyle w:val="CodeChar"/>
-        </w:rPr>
-        <w:t xml:space="preserve">PokeApiClient</w:t>
-      </w:r>
-      <w:r>
-        <w:t xml:space="preserve"> do projeto.</w:t>
+        <w:t xml:space="preserve">☐ </w:t>
+      </w:r>
+      <w:r>
+        <w:rPr>
+          <w:b/>
+        </w:rPr>
+        <w:t xml:space="preserve">I1.</w:t>
+      </w:r>
+      <w:r>
+        <w:t xml:space="preserve"> Peça ao Claude para explicar </w:t>
+      </w:r>
+      <w:r>
+        <w:rPr>
+          <w:rStyle w:val="CodeChar"/>
+        </w:rPr>
+        <w:t xml:space="preserve">PokedexApp.browse</w:t>
+      </w:r>
+      <w:r>
+        <w:t xml:space="preserve"> linha a linha e confira cada afirmação rodando o código.</w:t>
       </w:r>
     </w:p>
     <w:p>
@@ -22381,40 +22442,16 @@
         </w:numPr>
       </w:pPr>
       <w:r>
-        <w:rPr>
-          <w:b/>
-        </w:rPr>
-        <w:t xml:space="preserve">E2:</w:t>
-      </w:r>
-      <w:r>
-        <w:t xml:space="preserve"> </w:t>
-      </w:r>
-      <w:r>
-        <w:rPr>
-          <w:rStyle w:val="CodeChar"/>
-        </w:rPr>
-        <w:t xml:space="preserve">except Exception</w:t>
-      </w:r>
-      <w:r>
-        <w:t xml:space="preserve"> esconde bugs e chama qualquer falha de "not found", até "sem internet". Capture </w:t>
-      </w:r>
-      <w:r>
-        <w:rPr>
-          <w:rStyle w:val="CodeChar"/>
-        </w:rPr>
-        <w:t xml:space="preserve">PokemonNotFoundError</w:t>
-      </w:r>
-      <w:r>
-        <w:t xml:space="preserve"> e </w:t>
-      </w:r>
-      <w:r>
-        <w:rPr>
-          <w:rStyle w:val="CodeChar"/>
-        </w:rPr>
-        <w:t xml:space="preserve">PokedexError</w:t>
-      </w:r>
-      <w:r>
-        <w:t xml:space="preserve">.</w:t>
+        <w:t xml:space="preserve">☐ </w:t>
+      </w:r>
+      <w:r>
+        <w:rPr>
+          <w:b/>
+        </w:rPr>
+        <w:t xml:space="preserve">I2.</w:t>
+      </w:r>
+      <w:r>
+        <w:t xml:space="preserve"> Escreva um prompt ruim e um bom para o desafio D2 e compare os resultados.</w:t>
       </w:r>
     </w:p>
     <w:p>
@@ -22426,193 +22463,42 @@
         </w:numPr>
       </w:pPr>
       <w:r>
-        <w:rPr>
-          <w:b/>
-        </w:rPr>
-        <w:t xml:space="preserve">E3:</w:t>
-      </w:r>
-      <w:r>
-        <w:t xml:space="preserve"> imprime em vez de devolver; não dá para testar nem reutilizar. Devolva a </w:t>
-      </w:r>
-      <w:r>
-        <w:rPr>
-          <w:rStyle w:val="CodeChar"/>
-        </w:rPr>
-        <w:t xml:space="preserve">str</w:t>
-      </w:r>
-      <w:r>
-        <w:t xml:space="preserve">.</w:t>
-      </w:r>
-    </w:p>
-    <w:p>
-      <w:pPr>
-        <w:pStyle w:val="ListParagraph"/>
-        <w:numPr>
-          <w:ilvl w:val="0"/>
-          <w:numId w:val="35"/>
-        </w:numPr>
-      </w:pPr>
-      <w:r>
-        <w:rPr>
-          <w:b/>
-        </w:rPr>
-        <w:t xml:space="preserve">E4:</w:t>
-      </w:r>
-      <w:r>
-        <w:t xml:space="preserve"> o teste depende da internet (lento e frágil). Injete uma </w:t>
-      </w:r>
-      <w:r>
-        <w:rPr>
-          <w:rStyle w:val="CodeChar"/>
-        </w:rPr>
-        <w:t xml:space="preserve">Session</w:t>
-      </w:r>
-      <w:r>
-        <w:t xml:space="preserve"> com </w:t>
-      </w:r>
-      <w:r>
-        <w:rPr>
-          <w:rStyle w:val="CodeChar"/>
-        </w:rPr>
-        <w:t xml:space="preserve">get</w:t>
-      </w:r>
-      <w:r>
-        <w:t xml:space="preserve"> mockado, ou marque-o como </w:t>
-      </w:r>
-      <w:r>
-        <w:rPr>
-          <w:rStyle w:val="CodeChar"/>
-        </w:rPr>
-        <w:t xml:space="preserve">integration</w:t>
-      </w:r>
-      <w:r>
-        <w:t xml:space="preserve">.</w:t>
-      </w:r>
-    </w:p>
-    <w:p>
-      <w:pPr>
-        <w:pStyle w:val="ListParagraph"/>
-        <w:numPr>
-          <w:ilvl w:val="0"/>
-          <w:numId w:val="35"/>
-        </w:numPr>
-      </w:pPr>
-      <w:r>
-        <w:rPr>
-          <w:b/>
-        </w:rPr>
-        <w:t xml:space="preserve">E5:</w:t>
-      </w:r>
-      <w:r>
-        <w:t xml:space="preserve"> ordem errada: </w:t>
-      </w:r>
-      <w:r>
-        <w:rPr>
-          <w:rStyle w:val="CodeChar"/>
-        </w:rPr>
-        <w:t xml:space="preserve">Timeout</w:t>
-      </w:r>
-      <w:r>
-        <w:t xml:space="preserve"> é filha de </w:t>
-      </w:r>
-      <w:r>
-        <w:rPr>
-          <w:rStyle w:val="CodeChar"/>
-        </w:rPr>
-        <w:t xml:space="preserve">RequestException</w:t>
-      </w:r>
-      <w:r>
-        <w:t xml:space="preserve">, então o segundo </w:t>
-      </w:r>
-      <w:r>
-        <w:rPr>
-          <w:rStyle w:val="CodeChar"/>
-        </w:rPr>
-        <w:t xml:space="preserve">except</w:t>
-      </w:r>
-      <w:r>
-        <w:t xml:space="preserve"> nunca roda. Ponha </w:t>
-      </w:r>
-      <w:r>
-        <w:rPr>
-          <w:rStyle w:val="CodeChar"/>
-        </w:rPr>
-        <w:t xml:space="preserve">Timeout</w:t>
-      </w:r>
-      <w:r>
-        <w:t xml:space="preserve"> primeiro e use </w:t>
-      </w:r>
-      <w:r>
-        <w:rPr>
-          <w:rStyle w:val="CodeChar"/>
-        </w:rPr>
-        <w:t xml:space="preserve">from error</w:t>
-      </w:r>
-      <w:r>
-        <w:t xml:space="preserve">.</w:t>
-      </w:r>
-    </w:p>
-    <w:p>
-      <w:pPr>
-        <w:pStyle w:val="ListParagraph"/>
-        <w:numPr>
-          <w:ilvl w:val="0"/>
-          <w:numId w:val="35"/>
-        </w:numPr>
-      </w:pPr>
-      <w:r>
-        <w:rPr>
-          <w:b/>
-        </w:rPr>
-        <w:t xml:space="preserve">E6:</w:t>
-      </w:r>
-      <w:r>
-        <w:t xml:space="preserve"> </w:t>
-      </w:r>
-      <w:r>
-        <w:rPr>
-          <w:rStyle w:val="CodeChar"/>
-        </w:rPr>
-        <w:t xml:space="preserve">re.search</w:t>
-      </w:r>
-      <w:r>
-        <w:t xml:space="preserve"> aprova </w:t>
-      </w:r>
-      <w:r>
-        <w:rPr>
-          <w:rStyle w:val="CodeChar"/>
-        </w:rPr>
-        <w:t xml:space="preserve">../admin</w:t>
-      </w:r>
-      <w:r>
-        <w:t xml:space="preserve"> porque acha </w:t>
-      </w:r>
-      <w:r>
-        <w:rPr>
-          <w:rStyle w:val="CodeChar"/>
-        </w:rPr>
-        <w:t xml:space="preserve">admin</w:t>
-      </w:r>
-      <w:r>
-        <w:t xml:space="preserve"> no meio. Use </w:t>
-      </w:r>
-      <w:r>
-        <w:rPr>
-          <w:rStyle w:val="CodeChar"/>
-        </w:rPr>
-        <w:t xml:space="preserve">fullmatch</w:t>
-      </w:r>
-      <w:r>
-        <w:t xml:space="preserve"> com o padrão sem hífens nas pontas.</w:t>
-      </w:r>
-    </w:p>
-    <w:p>
-      <w:pPr/>
-      <w:r>
-        <w:rPr>
-          <w:b/>
-        </w:rPr>
-        <w:t xml:space="preserve">Módulo 1</w:t>
+        <w:t xml:space="preserve">☐ </w:t>
+      </w:r>
+      <w:r>
+        <w:rPr>
+          <w:b/>
+        </w:rPr>
+        <w:t xml:space="preserve">I3.</w:t>
+      </w:r>
+      <w:r>
+        <w:t xml:space="preserve"> Acrescente ao </w:t>
+      </w:r>
+      <w:r>
+        <w:rPr>
+          <w:rStyle w:val="CodeChar"/>
+        </w:rPr>
+        <w:t xml:space="preserve">CLAUDE.md</w:t>
+      </w:r>
+      <w:r>
+        <w:t xml:space="preserve"> uma regra nova com o motivo, e observe se o comportamento muda.</w:t>
+      </w:r>
+    </w:p>
+    <w:p>
+      <w:pPr>
+        <w:pStyle w:val="Heading3"/>
+      </w:pPr>
+      <w:r>
+        <w:t xml:space="preserve">Gabarito</w:t>
+      </w:r>
+    </w:p>
+    <w:p>
+      <w:pPr/>
+      <w:r>
+        <w:rPr>
+          <w:b/>
+        </w:rPr>
+        <w:t xml:space="preserve">Exercícios E1 a E6</w:t>
       </w:r>
     </w:p>
     <w:p>
@@ -22624,7 +22510,58 @@
         </w:numPr>
       </w:pPr>
       <w:r>
-        <w:t xml:space="preserve">Porque é uma regra exata e simples; código comum é mais rápido, barato e nunca erra a divisão.</w:t>
+        <w:rPr>
+          <w:b/>
+        </w:rPr>
+        <w:t xml:space="preserve">E1:</w:t>
+      </w:r>
+      <w:r>
+        <w:t xml:space="preserve"> sem </w:t>
+      </w:r>
+      <w:r>
+        <w:rPr>
+          <w:rStyle w:val="CodeChar"/>
+        </w:rPr>
+        <w:t xml:space="preserve">timeout</w:t>
+      </w:r>
+      <w:r>
+        <w:t xml:space="preserve"> (pode congelar para sempre), sem validar </w:t>
+      </w:r>
+      <w:r>
+        <w:rPr>
+          <w:rStyle w:val="CodeChar"/>
+        </w:rPr>
+        <w:t xml:space="preserve">name</w:t>
+      </w:r>
+      <w:r>
+        <w:t xml:space="preserve"> (</w:t>
+      </w:r>
+      <w:r>
+        <w:rPr>
+          <w:rStyle w:val="CodeChar"/>
+        </w:rPr>
+        <w:t xml:space="preserve">../</w:t>
+      </w:r>
+      <w:r>
+        <w:t xml:space="preserve"> muda a URL), sem checar o status (um 404 vira </w:t>
+      </w:r>
+      <w:r>
+        <w:rPr>
+          <w:rStyle w:val="CodeChar"/>
+        </w:rPr>
+        <w:t xml:space="preserve">KeyError</w:t>
+      </w:r>
+      <w:r>
+        <w:t xml:space="preserve"> depois) e tudo misturado numa função. Correção: o </w:t>
+      </w:r>
+      <w:r>
+        <w:rPr>
+          <w:rStyle w:val="CodeChar"/>
+        </w:rPr>
+        <w:t xml:space="preserve">PokeApiClient</w:t>
+      </w:r>
+      <w:r>
+        <w:t xml:space="preserve"> do projeto.</w:t>
       </w:r>
     </w:p>
     <w:p>
@@ -22636,7 +22573,40 @@
         </w:numPr>
       </w:pPr>
       <w:r>
-        <w:t xml:space="preserve">Um pedaço de texto (parte de palavra ou símbolo). O uso da API é cobrado por token, e a janela de contexto é medida em tokens.</w:t>
+        <w:rPr>
+          <w:b/>
+        </w:rPr>
+        <w:t xml:space="preserve">E2:</w:t>
+      </w:r>
+      <w:r>
+        <w:t xml:space="preserve"> </w:t>
+      </w:r>
+      <w:r>
+        <w:rPr>
+          <w:rStyle w:val="CodeChar"/>
+        </w:rPr>
+        <w:t xml:space="preserve">except Exception</w:t>
+      </w:r>
+      <w:r>
+        <w:t xml:space="preserve"> esconde bugs e chama qualquer falha de "not found", até "sem internet". Capture </w:t>
+      </w:r>
+      <w:r>
+        <w:rPr>
+          <w:rStyle w:val="CodeChar"/>
+        </w:rPr>
+        <w:t xml:space="preserve">PokemonNotFoundError</w:t>
+      </w:r>
+      <w:r>
+        <w:t xml:space="preserve"> e </w:t>
+      </w:r>
+      <w:r>
+        <w:rPr>
+          <w:rStyle w:val="CodeChar"/>
+        </w:rPr>
+        <w:t xml:space="preserve">PokedexError</w:t>
+      </w:r>
+      <w:r>
+        <w:t xml:space="preserve">.</w:t>
       </w:r>
     </w:p>
     <w:p>
@@ -22648,7 +22618,22 @@
         </w:numPr>
       </w:pPr>
       <w:r>
-        <w:t xml:space="preserve">Porque gera o texto mais provável, não o comprovadamente verdadeiro; um nome plausível pode não existir.</w:t>
+        <w:rPr>
+          <w:b/>
+        </w:rPr>
+        <w:t xml:space="preserve">E3:</w:t>
+      </w:r>
+      <w:r>
+        <w:t xml:space="preserve"> imprime em vez de devolver; não dá para testar nem reutilizar. Devolva a </w:t>
+      </w:r>
+      <w:r>
+        <w:rPr>
+          <w:rStyle w:val="CodeChar"/>
+        </w:rPr>
+        <w:t xml:space="preserve">str</w:t>
+      </w:r>
+      <w:r>
+        <w:t xml:space="preserve">.</w:t>
       </w:r>
     </w:p>
     <w:p>
@@ -22660,34 +22645,166 @@
         </w:numPr>
       </w:pPr>
       <w:r>
-        <w:t xml:space="preserve">Requisições reais salvas como fixtures; testes manuais de casos como </w:t>
-      </w:r>
-      <w:r>
-        <w:rPr>
-          <w:rStyle w:val="CodeChar"/>
-        </w:rPr>
-        <w:t xml:space="preserve">025</w:t>
-      </w:r>
-      <w:r>
-        <w:t xml:space="preserve"> e </w:t>
-      </w:r>
-      <w:r>
-        <w:rPr>
-          <w:rStyle w:val="CodeChar"/>
-        </w:rPr>
-        <w:t xml:space="preserve">deoxys</w:t>
-      </w:r>
-      <w:r>
-        <w:t xml:space="preserve">; consulta à referência oficial dos modelos.</w:t>
-      </w:r>
-    </w:p>
-    <w:p>
-      <w:pPr/>
-      <w:r>
-        <w:rPr>
-          <w:b/>
-        </w:rPr>
-        <w:t xml:space="preserve">Módulo 2</w:t>
+        <w:rPr>
+          <w:b/>
+        </w:rPr>
+        <w:t xml:space="preserve">E4:</w:t>
+      </w:r>
+      <w:r>
+        <w:t xml:space="preserve"> o teste depende da internet (lento e frágil). Injete uma </w:t>
+      </w:r>
+      <w:r>
+        <w:rPr>
+          <w:rStyle w:val="CodeChar"/>
+        </w:rPr>
+        <w:t xml:space="preserve">Session</w:t>
+      </w:r>
+      <w:r>
+        <w:t xml:space="preserve"> com </w:t>
+      </w:r>
+      <w:r>
+        <w:rPr>
+          <w:rStyle w:val="CodeChar"/>
+        </w:rPr>
+        <w:t xml:space="preserve">get</w:t>
+      </w:r>
+      <w:r>
+        <w:t xml:space="preserve"> mockado, ou marque-o como </w:t>
+      </w:r>
+      <w:r>
+        <w:rPr>
+          <w:rStyle w:val="CodeChar"/>
+        </w:rPr>
+        <w:t xml:space="preserve">integration</w:t>
+      </w:r>
+      <w:r>
+        <w:t xml:space="preserve">.</w:t>
+      </w:r>
+    </w:p>
+    <w:p>
+      <w:pPr>
+        <w:pStyle w:val="ListParagraph"/>
+        <w:numPr>
+          <w:ilvl w:val="0"/>
+          <w:numId w:val="36"/>
+        </w:numPr>
+      </w:pPr>
+      <w:r>
+        <w:rPr>
+          <w:b/>
+        </w:rPr>
+        <w:t xml:space="preserve">E5:</w:t>
+      </w:r>
+      <w:r>
+        <w:t xml:space="preserve"> ordem errada: </w:t>
+      </w:r>
+      <w:r>
+        <w:rPr>
+          <w:rStyle w:val="CodeChar"/>
+        </w:rPr>
+        <w:t xml:space="preserve">Timeout</w:t>
+      </w:r>
+      <w:r>
+        <w:t xml:space="preserve"> é filha de </w:t>
+      </w:r>
+      <w:r>
+        <w:rPr>
+          <w:rStyle w:val="CodeChar"/>
+        </w:rPr>
+        <w:t xml:space="preserve">RequestException</w:t>
+      </w:r>
+      <w:r>
+        <w:t xml:space="preserve">, então o segundo </w:t>
+      </w:r>
+      <w:r>
+        <w:rPr>
+          <w:rStyle w:val="CodeChar"/>
+        </w:rPr>
+        <w:t xml:space="preserve">except</w:t>
+      </w:r>
+      <w:r>
+        <w:t xml:space="preserve"> nunca roda. Ponha </w:t>
+      </w:r>
+      <w:r>
+        <w:rPr>
+          <w:rStyle w:val="CodeChar"/>
+        </w:rPr>
+        <w:t xml:space="preserve">Timeout</w:t>
+      </w:r>
+      <w:r>
+        <w:t xml:space="preserve"> primeiro e use </w:t>
+      </w:r>
+      <w:r>
+        <w:rPr>
+          <w:rStyle w:val="CodeChar"/>
+        </w:rPr>
+        <w:t xml:space="preserve">from error</w:t>
+      </w:r>
+      <w:r>
+        <w:t xml:space="preserve">.</w:t>
+      </w:r>
+    </w:p>
+    <w:p>
+      <w:pPr>
+        <w:pStyle w:val="ListParagraph"/>
+        <w:numPr>
+          <w:ilvl w:val="0"/>
+          <w:numId w:val="36"/>
+        </w:numPr>
+      </w:pPr>
+      <w:r>
+        <w:rPr>
+          <w:b/>
+        </w:rPr>
+        <w:t xml:space="preserve">E6:</w:t>
+      </w:r>
+      <w:r>
+        <w:t xml:space="preserve"> </w:t>
+      </w:r>
+      <w:r>
+        <w:rPr>
+          <w:rStyle w:val="CodeChar"/>
+        </w:rPr>
+        <w:t xml:space="preserve">re.search</w:t>
+      </w:r>
+      <w:r>
+        <w:t xml:space="preserve"> aprova </w:t>
+      </w:r>
+      <w:r>
+        <w:rPr>
+          <w:rStyle w:val="CodeChar"/>
+        </w:rPr>
+        <w:t xml:space="preserve">../admin</w:t>
+      </w:r>
+      <w:r>
+        <w:t xml:space="preserve"> porque acha </w:t>
+      </w:r>
+      <w:r>
+        <w:rPr>
+          <w:rStyle w:val="CodeChar"/>
+        </w:rPr>
+        <w:t xml:space="preserve">admin</w:t>
+      </w:r>
+      <w:r>
+        <w:t xml:space="preserve"> no meio. Use </w:t>
+      </w:r>
+      <w:r>
+        <w:rPr>
+          <w:rStyle w:val="CodeChar"/>
+        </w:rPr>
+        <w:t xml:space="preserve">fullmatch</w:t>
+      </w:r>
+      <w:r>
+        <w:t xml:space="preserve"> com o padrão sem hífens nas pontas.</w:t>
+      </w:r>
+    </w:p>
+    <w:p>
+      <w:pPr/>
+      <w:r>
+        <w:rPr>
+          <w:b/>
+        </w:rPr>
+        <w:t xml:space="preserve">Módulo 1</w:t>
       </w:r>
     </w:p>
     <w:p>
@@ -22699,7 +22816,7 @@
         </w:numPr>
       </w:pPr>
       <w:r>
-        <w:t xml:space="preserve">O modelo não muda nem guarda conversas; cada conversa começa com a janela de contexto vazia.</w:t>
+        <w:t xml:space="preserve">Porque é uma regra exata e simples; código comum é mais rápido, barato e nunca erra a divisão.</w:t>
       </w:r>
     </w:p>
     <w:p>
@@ -22711,22 +22828,7 @@
         </w:numPr>
       </w:pPr>
       <w:r>
-        <w:rPr>
-          <w:rStyle w:val="CodeChar"/>
-        </w:rPr>
-        <w:t xml:space="preserve">CLAUDE.md</w:t>
-      </w:r>
-      <w:r>
-        <w:t xml:space="preserve">, os arquivos de memória e o </w:t>
-      </w:r>
-      <w:r>
-        <w:rPr>
-          <w:rStyle w:val="CodeChar"/>
-        </w:rPr>
-        <w:t xml:space="preserve">ROADMAP.md</w:t>
-      </w:r>
-      <w:r>
-        <w:t xml:space="preserve">.</w:t>
+        <w:t xml:space="preserve">Um pedaço de texto (parte de palavra ou símbolo). O uso da API é cobrado por token, e a janela de contexto é medida em tokens.</w:t>
       </w:r>
     </w:p>
     <w:p>
@@ -22738,16 +22840,46 @@
         </w:numPr>
       </w:pPr>
       <w:r>
-        <w:t xml:space="preserve">O menor (Haiku): tarefa simples e de alto volume; teste a qualidade numa amostra antes de decidir.</w:t>
-      </w:r>
-    </w:p>
-    <w:p>
-      <w:pPr/>
-      <w:r>
-        <w:rPr>
-          <w:b/>
-        </w:rPr>
-        <w:t xml:space="preserve">Módulo 3</w:t>
+        <w:t xml:space="preserve">Porque gera o texto mais provável, não o comprovadamente verdadeiro; um nome plausível pode não existir.</w:t>
+      </w:r>
+    </w:p>
+    <w:p>
+      <w:pPr>
+        <w:pStyle w:val="ListParagraph"/>
+        <w:numPr>
+          <w:ilvl w:val="0"/>
+          <w:numId w:val="37"/>
+        </w:numPr>
+      </w:pPr>
+      <w:r>
+        <w:t xml:space="preserve">Requisições reais salvas como fixtures; testes manuais de casos como </w:t>
+      </w:r>
+      <w:r>
+        <w:rPr>
+          <w:rStyle w:val="CodeChar"/>
+        </w:rPr>
+        <w:t xml:space="preserve">025</w:t>
+      </w:r>
+      <w:r>
+        <w:t xml:space="preserve"> e </w:t>
+      </w:r>
+      <w:r>
+        <w:rPr>
+          <w:rStyle w:val="CodeChar"/>
+        </w:rPr>
+        <w:t xml:space="preserve">deoxys</w:t>
+      </w:r>
+      <w:r>
+        <w:t xml:space="preserve">; consulta à referência oficial dos modelos.</w:t>
+      </w:r>
+    </w:p>
+    <w:p>
+      <w:pPr/>
+      <w:r>
+        <w:rPr>
+          <w:b/>
+        </w:rPr>
+        <w:t xml:space="preserve">Módulo 2</w:t>
       </w:r>
     </w:p>
     <w:p>
@@ -22759,7 +22891,7 @@
         </w:numPr>
       </w:pPr>
       <w:r>
-        <w:t xml:space="preserve">Objetivo, contexto, restrições, critério de pronto e formato da saída.</w:t>
+        <w:t xml:space="preserve">O modelo não muda nem guarda conversas; cada conversa começa com a janela de contexto vazia.</w:t>
       </w:r>
     </w:p>
     <w:p>
@@ -22771,7 +22903,22 @@
         </w:numPr>
       </w:pPr>
       <w:r>
-        <w:t xml:space="preserve">Exemplo: "Crie um site estático de uma página, em HTML e CSS, com meu nome, três projetos com links e um formulário de contato; deve funcionar no celular; entregue os arquivos prontos para publicar no GitHub Pages."</w:t>
+        <w:rPr>
+          <w:rStyle w:val="CodeChar"/>
+        </w:rPr>
+        <w:t xml:space="preserve">CLAUDE.md</w:t>
+      </w:r>
+      <w:r>
+        <w:t xml:space="preserve">, os arquivos de memória e o </w:t>
+      </w:r>
+      <w:r>
+        <w:rPr>
+          <w:rStyle w:val="CodeChar"/>
+        </w:rPr>
+        <w:t xml:space="preserve">ROADMAP.md</w:t>
+      </w:r>
+      <w:r>
+        <w:t xml:space="preserve">.</w:t>
       </w:r>
     </w:p>
     <w:p>
@@ -22783,16 +22930,16 @@
         </w:numPr>
       </w:pPr>
       <w:r>
-        <w:t xml:space="preserve">O motivo deixa aplicar a regra a casos não previstos e evita obediência literal onde ela não faz sentido.</w:t>
-      </w:r>
-    </w:p>
-    <w:p>
-      <w:pPr/>
-      <w:r>
-        <w:rPr>
-          <w:b/>
-        </w:rPr>
-        <w:t xml:space="preserve">Módulo 4</w:t>
+        <w:t xml:space="preserve">O menor (Haiku): tarefa simples e de alto volume; teste a qualidade numa amostra antes de decidir.</w:t>
+      </w:r>
+    </w:p>
+    <w:p>
+      <w:pPr/>
+      <w:r>
+        <w:rPr>
+          <w:b/>
+        </w:rPr>
+        <w:t xml:space="preserve">Módulo 3</w:t>
       </w:r>
     </w:p>
     <w:p>
@@ -22804,7 +22951,7 @@
         </w:numPr>
       </w:pPr>
       <w:r>
-        <w:t xml:space="preserve">O chat só gera texto; o agente age com ferramentas e verifica o resultado.</w:t>
+        <w:t xml:space="preserve">Objetivo, contexto, restrições, critério de pronto e formato da saída.</w:t>
       </w:r>
     </w:p>
     <w:p>
@@ -22816,7 +22963,7 @@
         </w:numPr>
       </w:pPr>
       <w:r>
-        <w:t xml:space="preserve">O harness (o Claude Code); o modelo só pede.</w:t>
+        <w:t xml:space="preserve">Exemplo: "Crie um site estático de uma página, em HTML e CSS, com meu nome, três projetos com links e um formulário de contato; deve funcionar no celular; entregue os arquivos prontos para publicar no GitHub Pages."</w:t>
       </w:r>
     </w:p>
     <w:p>
@@ -22828,16 +22975,16 @@
         </w:numPr>
       </w:pPr>
       <w:r>
-        <w:t xml:space="preserve">Em "observar": a saída real do programa mostrou "Invalid option".</w:t>
-      </w:r>
-    </w:p>
-    <w:p>
-      <w:pPr/>
-      <w:r>
-        <w:rPr>
-          <w:b/>
-        </w:rPr>
-        <w:t xml:space="preserve">Módulo 5</w:t>
+        <w:t xml:space="preserve">O motivo deixa aplicar a regra a casos não previstos e evita obediência literal onde ela não faz sentido.</w:t>
+      </w:r>
+    </w:p>
+    <w:p>
+      <w:pPr/>
+      <w:r>
+        <w:rPr>
+          <w:b/>
+        </w:rPr>
+        <w:t xml:space="preserve">Módulo 4</w:t>
       </w:r>
     </w:p>
     <w:p>
@@ -22849,13 +22996,7 @@
         </w:numPr>
       </w:pPr>
       <w:r>
-        <w:rPr>
-          <w:rStyle w:val="CodeChar"/>
-        </w:rPr>
-        <w:t xml:space="preserve">CLAUDE.md</w:t>
-      </w:r>
-      <w:r>
-        <w:t xml:space="preserve"> é do projeto e vai no repositório; memória é da pessoa e da sua história de trabalho.</w:t>
+        <w:t xml:space="preserve">O chat só gera texto; o agente age com ferramentas e verifica o resultado.</w:t>
       </w:r>
     </w:p>
     <w:p>
@@ -22867,7 +23008,7 @@
         </w:numPr>
       </w:pPr>
       <w:r>
-        <w:t xml:space="preserve">Porque o arquivo é versionado e compartilhado; a chave vazaria.</w:t>
+        <w:t xml:space="preserve">O harness (o Claude Code); o modelo só pede.</w:t>
       </w:r>
     </w:p>
     <w:p>
@@ -22879,16 +23020,16 @@
         </w:numPr>
       </w:pPr>
       <w:r>
-        <w:t xml:space="preserve">Um hook: é executado pelo programa sempre, enquanto a instrução depende de o modelo segui-la.</w:t>
-      </w:r>
-    </w:p>
-    <w:p>
-      <w:pPr/>
-      <w:r>
-        <w:rPr>
-          <w:b/>
-        </w:rPr>
-        <w:t xml:space="preserve">Módulo 6</w:t>
+        <w:t xml:space="preserve">Em "observar": a saída real do programa mostrou "Invalid option".</w:t>
+      </w:r>
+    </w:p>
+    <w:p>
+      <w:pPr/>
+      <w:r>
+        <w:rPr>
+          <w:b/>
+        </w:rPr>
+        <w:t xml:space="preserve">Módulo 5</w:t>
       </w:r>
     </w:p>
     <w:p>
@@ -22900,7 +23041,13 @@
         </w:numPr>
       </w:pPr>
       <w:r>
-        <w:t xml:space="preserve">Para provar que o teste detecta o bug; um teste que passa com ou sem a correção não testa nada.</w:t>
+        <w:rPr>
+          <w:rStyle w:val="CodeChar"/>
+        </w:rPr>
+        <w:t xml:space="preserve">CLAUDE.md</w:t>
+      </w:r>
+      <w:r>
+        <w:t xml:space="preserve"> é do projeto e vai no repositório; memória é da pessoa e da sua história de trabalho.</w:t>
       </w:r>
     </w:p>
     <w:p>
@@ -22912,7 +23059,7 @@
         </w:numPr>
       </w:pPr>
       <w:r>
-        <w:t xml:space="preserve">Texto externo que tenta dar ordens ao modelo. O Pokedex aplica a ideia ao validar o nome vindo da API antes de usá-lo numa URL.</w:t>
+        <w:t xml:space="preserve">Porque o arquivo é versionado e compartilhado; a chave vazaria.</w:t>
       </w:r>
     </w:p>
     <w:p>
@@ -22924,16 +23071,16 @@
         </w:numPr>
       </w:pPr>
       <w:r>
-        <w:t xml:space="preserve">Por exemplo: pedir a explicação de cada decisão; tentar sozinho antes; refazer um módulo do zero.</w:t>
-      </w:r>
-    </w:p>
-    <w:p>
-      <w:pPr/>
-      <w:r>
-        <w:rPr>
-          <w:b/>
-        </w:rPr>
-        <w:t xml:space="preserve">Módulo 7</w:t>
+        <w:t xml:space="preserve">Um hook: é executado pelo programa sempre, enquanto a instrução depende de o modelo segui-la.</w:t>
+      </w:r>
+    </w:p>
+    <w:p>
+      <w:pPr/>
+      <w:r>
+        <w:rPr>
+          <w:b/>
+        </w:rPr>
+        <w:t xml:space="preserve">Módulo 6</w:t>
       </w:r>
     </w:p>
     <w:p>
@@ -22945,16 +23092,7 @@
         </w:numPr>
       </w:pPr>
       <w:r>
-        <w:t xml:space="preserve">É enorme, específico da máquina e se recria com </w:t>
-      </w:r>
-      <w:r>
-        <w:rPr>
-          <w:rStyle w:val="CodeChar"/>
-        </w:rPr>
-        <w:t xml:space="preserve">requirements</w:t>
-      </w:r>
-      <w:r>
-        <w:t xml:space="preserve">.</w:t>
+        <w:t xml:space="preserve">Para provar que o teste detecta o bug; um teste que passa com ou sem a correção não testa nada.</w:t>
       </w:r>
     </w:p>
     <w:p>
@@ -22966,40 +23104,7 @@
         </w:numPr>
       </w:pPr>
       <w:r>
-        <w:rPr>
-          <w:rStyle w:val="CodeChar"/>
-        </w:rPr>
-        <w:t xml:space="preserve">mypy</w:t>
-      </w:r>
-      <w:r>
-        <w:t xml:space="preserve"> em </w:t>
-      </w:r>
-      <w:r>
-        <w:rPr>
-          <w:rStyle w:val="CodeChar"/>
-        </w:rPr>
-        <w:t xml:space="preserve">requirements-dev.txt</w:t>
-      </w:r>
-      <w:r>
-        <w:t xml:space="preserve"> (só para desenvolver); </w:t>
-      </w:r>
-      <w:r>
-        <w:rPr>
-          <w:rStyle w:val="CodeChar"/>
-        </w:rPr>
-        <w:t xml:space="preserve">requests</w:t>
-      </w:r>
-      <w:r>
-        <w:t xml:space="preserve"> em </w:t>
-      </w:r>
-      <w:r>
-        <w:rPr>
-          <w:rStyle w:val="CodeChar"/>
-        </w:rPr>
-        <w:t xml:space="preserve">requirements.txt</w:t>
-      </w:r>
-      <w:r>
-        <w:t xml:space="preserve"> (o programa quebra sem ele).</w:t>
+        <w:t xml:space="preserve">Texto externo que tenta dar ordens ao modelo. O Pokedex aplica a ideia ao validar o nome vindo da API antes de usá-lo numa URL.</w:t>
       </w:r>
     </w:p>
     <w:p>
@@ -23011,16 +23116,16 @@
         </w:numPr>
       </w:pPr>
       <w:r>
-        <w:t xml:space="preserve">O Python escrevia em cp1252 e o Git Bash lia como UTF-8.</w:t>
-      </w:r>
-    </w:p>
-    <w:p>
-      <w:pPr/>
-      <w:r>
-        <w:rPr>
-          <w:b/>
-        </w:rPr>
-        <w:t xml:space="preserve">Módulo 8</w:t>
+        <w:t xml:space="preserve">Por exemplo: pedir a explicação de cada decisão; tentar sozinho antes; refazer um módulo do zero.</w:t>
+      </w:r>
+    </w:p>
+    <w:p>
+      <w:pPr/>
+      <w:r>
+        <w:rPr>
+          <w:b/>
+        </w:rPr>
+        <w:t xml:space="preserve">Módulo 7</w:t>
       </w:r>
     </w:p>
     <w:p>
@@ -23032,25 +23137,16 @@
         </w:numPr>
       </w:pPr>
       <w:r>
-        <w:t xml:space="preserve">Módulo é um arquivo </w:t>
-      </w:r>
-      <w:r>
-        <w:rPr>
-          <w:rStyle w:val="CodeChar"/>
-        </w:rPr>
-        <w:t xml:space="preserve">.py</w:t>
-      </w:r>
-      <w:r>
-        <w:t xml:space="preserve">; pacote é uma pasta com </w:t>
-      </w:r>
-      <w:r>
-        <w:rPr>
-          <w:rStyle w:val="CodeChar"/>
-        </w:rPr>
-        <w:t xml:space="preserve">__init__.py</w:t>
-      </w:r>
-      <w:r>
-        <w:t xml:space="preserve"> que agrupa módulos.</w:t>
+        <w:t xml:space="preserve">É enorme, específico da máquina e se recria com </w:t>
+      </w:r>
+      <w:r>
+        <w:rPr>
+          <w:rStyle w:val="CodeChar"/>
+        </w:rPr>
+        <w:t xml:space="preserve">requirements</w:t>
+      </w:r>
+      <w:r>
+        <w:t xml:space="preserve">.</w:t>
       </w:r>
     </w:p>
     <w:p>
@@ -23062,25 +23158,40 @@
         </w:numPr>
       </w:pPr>
       <w:r>
-        <w:t xml:space="preserve">O Python executa </w:t>
-      </w:r>
-      <w:r>
-        <w:rPr>
-          <w:rStyle w:val="CodeChar"/>
-        </w:rPr>
-        <w:t xml:space="preserve">pokedex/__main__.py</w:t>
-      </w:r>
-      <w:r>
-        <w:t xml:space="preserve">, que chama </w:t>
-      </w:r>
-      <w:r>
-        <w:rPr>
-          <w:rStyle w:val="CodeChar"/>
-        </w:rPr>
-        <w:t xml:space="preserve">main()</w:t>
-      </w:r>
-      <w:r>
-        <w:t xml:space="preserve"> e sai com o código devolvido.</w:t>
+        <w:rPr>
+          <w:rStyle w:val="CodeChar"/>
+        </w:rPr>
+        <w:t xml:space="preserve">mypy</w:t>
+      </w:r>
+      <w:r>
+        <w:t xml:space="preserve"> em </w:t>
+      </w:r>
+      <w:r>
+        <w:rPr>
+          <w:rStyle w:val="CodeChar"/>
+        </w:rPr>
+        <w:t xml:space="preserve">requirements-dev.txt</w:t>
+      </w:r>
+      <w:r>
+        <w:t xml:space="preserve"> (só para desenvolver); </w:t>
+      </w:r>
+      <w:r>
+        <w:rPr>
+          <w:rStyle w:val="CodeChar"/>
+        </w:rPr>
+        <w:t xml:space="preserve">requests</w:t>
+      </w:r>
+      <w:r>
+        <w:t xml:space="preserve"> em </w:t>
+      </w:r>
+      <w:r>
+        <w:rPr>
+          <w:rStyle w:val="CodeChar"/>
+        </w:rPr>
+        <w:t xml:space="preserve">requirements.txt</w:t>
+      </w:r>
+      <w:r>
+        <w:t xml:space="preserve"> (o programa quebra sem ele).</w:t>
       </w:r>
     </w:p>
     <w:p>
@@ -23092,16 +23203,16 @@
         </w:numPr>
       </w:pPr>
       <w:r>
-        <w:t xml:space="preserve">Porque rodaria a cada import, inclusive nos testes, fazendo requisições sem ninguém pedir.</w:t>
-      </w:r>
-    </w:p>
-    <w:p>
-      <w:pPr/>
-      <w:r>
-        <w:rPr>
-          <w:b/>
-        </w:rPr>
-        <w:t xml:space="preserve">Módulo 9</w:t>
+        <w:t xml:space="preserve">O Python escrevia em cp1252 e o Git Bash lia como UTF-8.</w:t>
+      </w:r>
+    </w:p>
+    <w:p>
+      <w:pPr/>
+      <w:r>
+        <w:rPr>
+          <w:b/>
+        </w:rPr>
+        <w:t xml:space="preserve">Módulo 8</w:t>
       </w:r>
     </w:p>
     <w:p>
@@ -23113,25 +23224,25 @@
         </w:numPr>
       </w:pPr>
       <w:r>
-        <w:t xml:space="preserve">O valor pode ser uma </w:t>
-      </w:r>
-      <w:r>
-        <w:rPr>
-          <w:rStyle w:val="CodeChar"/>
-        </w:rPr>
-        <w:t xml:space="preserve">str</w:t>
-      </w:r>
-      <w:r>
-        <w:t xml:space="preserve"> ou </w:t>
-      </w:r>
-      <w:r>
-        <w:rPr>
-          <w:rStyle w:val="CodeChar"/>
-        </w:rPr>
-        <w:t xml:space="preserve">None</w:t>
-      </w:r>
-      <w:r>
-        <w:t xml:space="preserve">.</w:t>
+        <w:t xml:space="preserve">Módulo é um arquivo </w:t>
+      </w:r>
+      <w:r>
+        <w:rPr>
+          <w:rStyle w:val="CodeChar"/>
+        </w:rPr>
+        <w:t xml:space="preserve">.py</w:t>
+      </w:r>
+      <w:r>
+        <w:t xml:space="preserve">; pacote é uma pasta com </w:t>
+      </w:r>
+      <w:r>
+        <w:rPr>
+          <w:rStyle w:val="CodeChar"/>
+        </w:rPr>
+        <w:t xml:space="preserve">__init__.py</w:t>
+      </w:r>
+      <w:r>
+        <w:t xml:space="preserve"> que agrupa módulos.</w:t>
       </w:r>
     </w:p>
     <w:p>
@@ -23143,34 +23254,25 @@
         </w:numPr>
       </w:pPr>
       <w:r>
-        <w:t xml:space="preserve">Porque </w:t>
-      </w:r>
-      <w:r>
-        <w:rPr>
-          <w:rStyle w:val="CodeChar"/>
-        </w:rPr>
-        <w:t xml:space="preserve">bool</w:t>
-      </w:r>
-      <w:r>
-        <w:t xml:space="preserve"> é subclasse de </w:t>
-      </w:r>
-      <w:r>
-        <w:rPr>
-          <w:rStyle w:val="CodeChar"/>
-        </w:rPr>
-        <w:t xml:space="preserve">int</w:t>
-      </w:r>
-      <w:r>
-        <w:t xml:space="preserve"> em Python; sem a checagem, </w:t>
-      </w:r>
-      <w:r>
-        <w:rPr>
-          <w:rStyle w:val="CodeChar"/>
-        </w:rPr>
-        <w:t xml:space="preserve">True</w:t>
-      </w:r>
-      <w:r>
-        <w:t xml:space="preserve"> passaria como 1.</w:t>
+        <w:t xml:space="preserve">O Python executa </w:t>
+      </w:r>
+      <w:r>
+        <w:rPr>
+          <w:rStyle w:val="CodeChar"/>
+        </w:rPr>
+        <w:t xml:space="preserve">pokedex/__main__.py</w:t>
+      </w:r>
+      <w:r>
+        <w:t xml:space="preserve">, que chama </w:t>
+      </w:r>
+      <w:r>
+        <w:rPr>
+          <w:rStyle w:val="CodeChar"/>
+        </w:rPr>
+        <w:t xml:space="preserve">main()</w:t>
+      </w:r>
+      <w:r>
+        <w:t xml:space="preserve"> e sai com o código devolvido.</w:t>
       </w:r>
     </w:p>
     <w:p>
@@ -23182,16 +23284,16 @@
         </w:numPr>
       </w:pPr>
       <w:r>
-        <w:t xml:space="preserve">Para o mypy, o editor e as pessoas acharem erros antes de rodar, e como documentação.</w:t>
-      </w:r>
-    </w:p>
-    <w:p>
-      <w:pPr/>
-      <w:r>
-        <w:rPr>
-          <w:b/>
-        </w:rPr>
-        <w:t xml:space="preserve">Módulo 10</w:t>
+        <w:t xml:space="preserve">Porque rodaria a cada import, inclusive nos testes, fazendo requisições sem ninguém pedir.</w:t>
+      </w:r>
+    </w:p>
+    <w:p>
+      <w:pPr/>
+      <w:r>
+        <w:rPr>
+          <w:b/>
+        </w:rPr>
+        <w:t xml:space="preserve">Módulo 9</w:t>
       </w:r>
     </w:p>
     <w:p>
@@ -23203,22 +23305,25 @@
         </w:numPr>
       </w:pPr>
       <w:r>
-        <w:rPr>
-          <w:rStyle w:val="CodeChar"/>
-        </w:rPr>
-        <w:t xml:space="preserve">format_pokemon</w:t>
-      </w:r>
-      <w:r>
-        <w:t xml:space="preserve"> é pura (só devolve texto). </w:t>
-      </w:r>
-      <w:r>
-        <w:rPr>
-          <w:rStyle w:val="CodeChar"/>
-        </w:rPr>
-        <w:t xml:space="preserve">search</w:t>
-      </w:r>
-      <w:r>
-        <w:t xml:space="preserve"> não: lê entrada, consulta a fonte e imprime.</w:t>
+        <w:t xml:space="preserve">O valor pode ser uma </w:t>
+      </w:r>
+      <w:r>
+        <w:rPr>
+          <w:rStyle w:val="CodeChar"/>
+        </w:rPr>
+        <w:t xml:space="preserve">str</w:t>
+      </w:r>
+      <w:r>
+        <w:t xml:space="preserve"> ou </w:t>
+      </w:r>
+      <w:r>
+        <w:rPr>
+          <w:rStyle w:val="CodeChar"/>
+        </w:rPr>
+        <w:t xml:space="preserve">None</w:t>
+      </w:r>
+      <w:r>
+        <w:t xml:space="preserve">.</w:t>
       </w:r>
     </w:p>
     <w:p>
@@ -23230,13 +23335,34 @@
         </w:numPr>
       </w:pPr>
       <w:r>
-        <w:rPr>
-          <w:rStyle w:val="CodeChar"/>
-        </w:rPr>
-        <w:t xml:space="preserve">"007"</w:t>
-      </w:r>
-      <w:r>
-        <w:t xml:space="preserve">.</w:t>
+        <w:t xml:space="preserve">Porque </w:t>
+      </w:r>
+      <w:r>
+        <w:rPr>
+          <w:rStyle w:val="CodeChar"/>
+        </w:rPr>
+        <w:t xml:space="preserve">bool</w:t>
+      </w:r>
+      <w:r>
+        <w:t xml:space="preserve"> é subclasse de </w:t>
+      </w:r>
+      <w:r>
+        <w:rPr>
+          <w:rStyle w:val="CodeChar"/>
+        </w:rPr>
+        <w:t xml:space="preserve">int</w:t>
+      </w:r>
+      <w:r>
+        <w:t xml:space="preserve"> em Python; sem a checagem, </w:t>
+      </w:r>
+      <w:r>
+        <w:rPr>
+          <w:rStyle w:val="CodeChar"/>
+        </w:rPr>
+        <w:t xml:space="preserve">True</w:t>
+      </w:r>
+      <w:r>
+        <w:t xml:space="preserve"> passaria como 1.</w:t>
       </w:r>
     </w:p>
     <w:p>
@@ -23248,16 +23374,16 @@
         </w:numPr>
       </w:pPr>
       <w:r>
-        <w:t xml:space="preserve">A lista padrão é criada uma única vez e compartilhada entre todas as chamadas.</w:t>
-      </w:r>
-    </w:p>
-    <w:p>
-      <w:pPr/>
-      <w:r>
-        <w:rPr>
-          <w:b/>
-        </w:rPr>
-        <w:t xml:space="preserve">Módulo 11</w:t>
+        <w:t xml:space="preserve">Para o mypy, o editor e as pessoas acharem erros antes de rodar, e como documentação.</w:t>
+      </w:r>
+    </w:p>
+    <w:p>
+      <w:pPr/>
+      <w:r>
+        <w:rPr>
+          <w:b/>
+        </w:rPr>
+        <w:t xml:space="preserve">Módulo 10</w:t>
       </w:r>
     </w:p>
     <w:p>
@@ -23269,7 +23395,22 @@
         </w:numPr>
       </w:pPr>
       <w:r>
-        <w:t xml:space="preserve">Porque o mesmo objeto fica no cache e é compartilhado; alterá-lo estragaria os dados de outras partes.</w:t>
+        <w:rPr>
+          <w:rStyle w:val="CodeChar"/>
+        </w:rPr>
+        <w:t xml:space="preserve">format_pokemon</w:t>
+      </w:r>
+      <w:r>
+        <w:t xml:space="preserve"> é pura (só devolve texto). </w:t>
+      </w:r>
+      <w:r>
+        <w:rPr>
+          <w:rStyle w:val="CodeChar"/>
+        </w:rPr>
+        <w:t xml:space="preserve">search</w:t>
+      </w:r>
+      <w:r>
+        <w:t xml:space="preserve"> não: lê entrada, consulta a fonte e imprime.</w:t>
       </w:r>
     </w:p>
     <w:p>
@@ -23281,16 +23422,13 @@
         </w:numPr>
       </w:pPr>
       <w:r>
-        <w:t xml:space="preserve">Criar um </w:t>
-      </w:r>
-      <w:r>
-        <w:rPr>
-          <w:rStyle w:val="CodeChar"/>
-        </w:rPr>
-        <w:t xml:space="preserve">Pokemon</w:t>
-      </w:r>
-      <w:r>
-        <w:t xml:space="preserve"> a partir de outro formato (o JSON da API), mantendo só os campos necessários.</w:t>
+        <w:rPr>
+          <w:rStyle w:val="CodeChar"/>
+        </w:rPr>
+        <w:t xml:space="preserve">"007"</w:t>
+      </w:r>
+      <w:r>
+        <w:t xml:space="preserve">.</w:t>
       </w:r>
     </w:p>
     <w:p>
@@ -23302,37 +23440,16 @@
         </w:numPr>
       </w:pPr>
       <w:r>
-        <w:t xml:space="preserve">Misturaria responsabilidades (menu e HTTP) e impediria testar o menu com uma fonte falsa.</w:t>
-      </w:r>
-    </w:p>
-    <w:p>
-      <w:pPr>
-        <w:pStyle w:val="ListParagraph"/>
-        <w:numPr>
-          <w:ilvl w:val="0"/>
-          <w:numId w:val="46"/>
-        </w:numPr>
-      </w:pPr>
-      <w:r>
-        <w:t xml:space="preserve">O </w:t>
-      </w:r>
-      <w:r>
-        <w:rPr>
-          <w:rStyle w:val="CodeChar"/>
-        </w:rPr>
-        <w:t xml:space="preserve">__exit__</w:t>
-      </w:r>
-      <w:r>
-        <w:t xml:space="preserve"> roda e fecha as conexões, mesmo se houve exceção.</w:t>
-      </w:r>
-    </w:p>
-    <w:p>
-      <w:pPr/>
-      <w:r>
-        <w:rPr>
-          <w:b/>
-        </w:rPr>
-        <w:t xml:space="preserve">Módulo 12</w:t>
+        <w:t xml:space="preserve">A lista padrão é criada uma única vez e compartilhada entre todas as chamadas.</w:t>
+      </w:r>
+    </w:p>
+    <w:p>
+      <w:pPr/>
+      <w:r>
+        <w:rPr>
+          <w:b/>
+        </w:rPr>
+        <w:t xml:space="preserve">Módulo 11</w:t>
       </w:r>
     </w:p>
     <w:p>
@@ -23344,22 +23461,7 @@
         </w:numPr>
       </w:pPr>
       <w:r>
-        <w:rPr>
-          <w:rStyle w:val="CodeChar"/>
-        </w:rPr>
-        <w:t xml:space="preserve">Timeout</w:t>
-      </w:r>
-      <w:r>
-        <w:t xml:space="preserve"> é filha de </w:t>
-      </w:r>
-      <w:r>
-        <w:rPr>
-          <w:rStyle w:val="CodeChar"/>
-        </w:rPr>
-        <w:t xml:space="preserve">RequestException</w:t>
-      </w:r>
-      <w:r>
-        <w:t xml:space="preserve">; se a mãe vier antes, captura o timeout primeiro.</w:t>
+        <w:t xml:space="preserve">Porque o mesmo objeto fica no cache e é compartilhado; alterá-lo estragaria os dados de outras partes.</w:t>
       </w:r>
     </w:p>
     <w:p>
@@ -23371,16 +23473,16 @@
         </w:numPr>
       </w:pPr>
       <w:r>
-        <w:t xml:space="preserve">A exceção original, em </w:t>
-      </w:r>
-      <w:r>
-        <w:rPr>
-          <w:rStyle w:val="CodeChar"/>
-        </w:rPr>
-        <w:t xml:space="preserve">__cause__</w:t>
-      </w:r>
-      <w:r>
-        <w:t xml:space="preserve">, para depuração.</w:t>
+        <w:t xml:space="preserve">Criar um </w:t>
+      </w:r>
+      <w:r>
+        <w:rPr>
+          <w:rStyle w:val="CodeChar"/>
+        </w:rPr>
+        <w:t xml:space="preserve">Pokemon</w:t>
+      </w:r>
+      <w:r>
+        <w:t xml:space="preserve"> a partir de outro formato (o JSON da API), mantendo só os campos necessários.</w:t>
       </w:r>
     </w:p>
     <w:p>
@@ -23392,7 +23494,7 @@
         </w:numPr>
       </w:pPr>
       <w:r>
-        <w:t xml:space="preserve">Esconde bugs reais e dá a mesma mensagem para problemas diferentes.</w:t>
+        <w:t xml:space="preserve">Misturaria responsabilidades (menu e HTTP) e impediria testar o menu com uma fonte falsa.</w:t>
       </w:r>
     </w:p>
     <w:p>
@@ -23404,16 +23506,25 @@
         </w:numPr>
       </w:pPr>
       <w:r>
-        <w:t xml:space="preserve">1, com a mensagem em stderr.</w:t>
-      </w:r>
-    </w:p>
-    <w:p>
-      <w:pPr/>
-      <w:r>
-        <w:rPr>
-          <w:b/>
-        </w:rPr>
-        <w:t xml:space="preserve">Módulo 13</w:t>
+        <w:t xml:space="preserve">O </w:t>
+      </w:r>
+      <w:r>
+        <w:rPr>
+          <w:rStyle w:val="CodeChar"/>
+        </w:rPr>
+        <w:t xml:space="preserve">__exit__</w:t>
+      </w:r>
+      <w:r>
+        <w:t xml:space="preserve"> roda e fecha as conexões, mesmo se houve exceção.</w:t>
+      </w:r>
+    </w:p>
+    <w:p>
+      <w:pPr/>
+      <w:r>
+        <w:rPr>
+          <w:b/>
+        </w:rPr>
+        <w:t xml:space="preserve">Módulo 12</w:t>
       </w:r>
     </w:p>
     <w:p>
@@ -23425,25 +23536,22 @@
         </w:numPr>
       </w:pPr>
       <w:r>
-        <w:t xml:space="preserve">Porque a API responde 404 para </w:t>
-      </w:r>
-      <w:r>
-        <w:rPr>
-          <w:rStyle w:val="CodeChar"/>
-        </w:rPr>
-        <w:t xml:space="preserve">025</w:t>
-      </w:r>
-      <w:r>
-        <w:t xml:space="preserve">; </w:t>
-      </w:r>
-      <w:r>
-        <w:rPr>
-          <w:rStyle w:val="CodeChar"/>
-        </w:rPr>
-        <w:t xml:space="preserve">int()</w:t>
-      </w:r>
-      <w:r>
-        <w:t xml:space="preserve"> remove os zeros à esquerda.</w:t>
+        <w:rPr>
+          <w:rStyle w:val="CodeChar"/>
+        </w:rPr>
+        <w:t xml:space="preserve">Timeout</w:t>
+      </w:r>
+      <w:r>
+        <w:t xml:space="preserve"> é filha de </w:t>
+      </w:r>
+      <w:r>
+        <w:rPr>
+          <w:rStyle w:val="CodeChar"/>
+        </w:rPr>
+        <w:t xml:space="preserve">RequestException</w:t>
+      </w:r>
+      <w:r>
+        <w:t xml:space="preserve">; se a mãe vier antes, captura o timeout primeiro.</w:t>
       </w:r>
     </w:p>
     <w:p>
@@ -23455,22 +23563,16 @@
         </w:numPr>
       </w:pPr>
       <w:r>
-        <w:rPr>
-          <w:rStyle w:val="CodeChar"/>
-        </w:rPr>
-        <w:t xml:space="preserve">fullmatch</w:t>
-      </w:r>
-      <w:r>
-        <w:t xml:space="preserve"> exige que o texto inteiro siga o padrão; </w:t>
-      </w:r>
-      <w:r>
-        <w:rPr>
-          <w:rStyle w:val="CodeChar"/>
-        </w:rPr>
-        <w:t xml:space="preserve">search</w:t>
-      </w:r>
-      <w:r>
-        <w:t xml:space="preserve"> aceita se qualquer pedaço combinar.</w:t>
+        <w:t xml:space="preserve">A exceção original, em </w:t>
+      </w:r>
+      <w:r>
+        <w:rPr>
+          <w:rStyle w:val="CodeChar"/>
+        </w:rPr>
+        <w:t xml:space="preserve">__cause__</w:t>
+      </w:r>
+      <w:r>
+        <w:t xml:space="preserve">, para depuração.</w:t>
       </w:r>
     </w:p>
     <w:p>
@@ -23482,16 +23584,28 @@
         </w:numPr>
       </w:pPr>
       <w:r>
-        <w:t xml:space="preserve">Dado externo nunca é totalmente confiável; um servidor comprometido poderia redirecionar o programa.</w:t>
-      </w:r>
-    </w:p>
-    <w:p>
-      <w:pPr/>
-      <w:r>
-        <w:rPr>
-          <w:b/>
-        </w:rPr>
-        <w:t xml:space="preserve">Módulo 14</w:t>
+        <w:t xml:space="preserve">Esconde bugs reais e dá a mesma mensagem para problemas diferentes.</w:t>
+      </w:r>
+    </w:p>
+    <w:p>
+      <w:pPr>
+        <w:pStyle w:val="ListParagraph"/>
+        <w:numPr>
+          <w:ilvl w:val="0"/>
+          <w:numId w:val="48"/>
+        </w:numPr>
+      </w:pPr>
+      <w:r>
+        <w:t xml:space="preserve">1, com a mensagem em stderr.</w:t>
+      </w:r>
+    </w:p>
+    <w:p>
+      <w:pPr/>
+      <w:r>
+        <w:rPr>
+          <w:b/>
+        </w:rPr>
+        <w:t xml:space="preserve">Módulo 13</w:t>
       </w:r>
     </w:p>
     <w:p>
@@ -23503,7 +23617,25 @@
         </w:numPr>
       </w:pPr>
       <w:r>
-        <w:t xml:space="preserve">404: o recurso não existe (repetir não adianta). 503: servidor indisponível (tentar mais tarde pode resolver).</w:t>
+        <w:t xml:space="preserve">Porque a API responde 404 para </w:t>
+      </w:r>
+      <w:r>
+        <w:rPr>
+          <w:rStyle w:val="CodeChar"/>
+        </w:rPr>
+        <w:t xml:space="preserve">025</w:t>
+      </w:r>
+      <w:r>
+        <w:t xml:space="preserve">; </w:t>
+      </w:r>
+      <w:r>
+        <w:rPr>
+          <w:rStyle w:val="CodeChar"/>
+        </w:rPr>
+        <w:t xml:space="preserve">int()</w:t>
+      </w:r>
+      <w:r>
+        <w:t xml:space="preserve"> remove os zeros à esquerda.</w:t>
       </w:r>
     </w:p>
     <w:p>
@@ -23518,10 +23650,19 @@
         <w:rPr>
           <w:rStyle w:val="CodeChar"/>
         </w:rPr>
-        <w:t xml:space="preserve">offset=40</w:t>
-      </w:r>
-      <w:r>
-        <w:t xml:space="preserve">.</w:t>
+        <w:t xml:space="preserve">fullmatch</w:t>
+      </w:r>
+      <w:r>
+        <w:t xml:space="preserve"> exige que o texto inteiro siga o padrão; </w:t>
+      </w:r>
+      <w:r>
+        <w:rPr>
+          <w:rStyle w:val="CodeChar"/>
+        </w:rPr>
+        <w:t xml:space="preserve">search</w:t>
+      </w:r>
+      <w:r>
+        <w:t xml:space="preserve"> aceita se qualquer pedaço combinar.</w:t>
       </w:r>
     </w:p>
     <w:p>
@@ -23533,28 +23674,16 @@
         </w:numPr>
       </w:pPr>
       <w:r>
-        <w:t xml:space="preserve">Porque GET não altera nada no servidor e repetir dá o mesmo resultado.</w:t>
-      </w:r>
-    </w:p>
-    <w:p>
-      <w:pPr>
-        <w:pStyle w:val="ListParagraph"/>
-        <w:numPr>
-          <w:ilvl w:val="0"/>
-          <w:numId w:val="49"/>
-        </w:numPr>
-      </w:pPr>
-      <w:r>
-        <w:t xml:space="preserve">60 hectogramas = 6,0 kg.</w:t>
-      </w:r>
-    </w:p>
-    <w:p>
-      <w:pPr/>
-      <w:r>
-        <w:rPr>
-          <w:b/>
-        </w:rPr>
-        <w:t xml:space="preserve">Módulo 15</w:t>
+        <w:t xml:space="preserve">Dado externo nunca é totalmente confiável; um servidor comprometido poderia redirecionar o programa.</w:t>
+      </w:r>
+    </w:p>
+    <w:p>
+      <w:pPr/>
+      <w:r>
+        <w:rPr>
+          <w:b/>
+        </w:rPr>
+        <w:t xml:space="preserve">Módulo 14</w:t>
       </w:r>
     </w:p>
     <w:p>
@@ -23566,7 +23695,7 @@
         </w:numPr>
       </w:pPr>
       <w:r>
-        <w:t xml:space="preserve">Fica esperando para sempre: o programa congela.</w:t>
+        <w:t xml:space="preserve">404: o recurso não existe (repetir não adianta). 503: servidor indisponível (tentar mais tarde pode resolver).</w:t>
       </w:r>
     </w:p>
     <w:p>
@@ -23578,16 +23707,13 @@
         </w:numPr>
       </w:pPr>
       <w:r>
-        <w:t xml:space="preserve">Não; a resposta chega com </w:t>
-      </w:r>
-      <w:r>
-        <w:rPr>
-          <w:rStyle w:val="CodeChar"/>
-        </w:rPr>
-        <w:t xml:space="preserve">status_code == 404</w:t>
-      </w:r>
-      <w:r>
-        <w:t xml:space="preserve"> e o código precisa verificá-lo.</w:t>
+        <w:rPr>
+          <w:rStyle w:val="CodeChar"/>
+        </w:rPr>
+        <w:t xml:space="preserve">offset=40</w:t>
+      </w:r>
+      <w:r>
+        <w:t xml:space="preserve">.</w:t>
       </w:r>
     </w:p>
     <w:p>
@@ -23599,16 +23725,28 @@
         </w:numPr>
       </w:pPr>
       <w:r>
-        <w:t xml:space="preserve">Reaproveita conexões (mais rápido) e pode ser injetada (testes sem internet).</w:t>
-      </w:r>
-    </w:p>
-    <w:p>
-      <w:pPr/>
-      <w:r>
-        <w:rPr>
-          <w:b/>
-        </w:rPr>
-        <w:t xml:space="preserve">Módulo 16</w:t>
+        <w:t xml:space="preserve">Porque GET não altera nada no servidor e repetir dá o mesmo resultado.</w:t>
+      </w:r>
+    </w:p>
+    <w:p>
+      <w:pPr>
+        <w:pStyle w:val="ListParagraph"/>
+        <w:numPr>
+          <w:ilvl w:val="0"/>
+          <w:numId w:val="50"/>
+        </w:numPr>
+      </w:pPr>
+      <w:r>
+        <w:t xml:space="preserve">60 hectogramas = 6,0 kg.</w:t>
+      </w:r>
+    </w:p>
+    <w:p>
+      <w:pPr/>
+      <w:r>
+        <w:rPr>
+          <w:b/>
+        </w:rPr>
+        <w:t xml:space="preserve">Módulo 15</w:t>
       </w:r>
     </w:p>
     <w:p>
@@ -23620,16 +23758,7 @@
         </w:numPr>
       </w:pPr>
       <w:r>
-        <w:t xml:space="preserve">Apenas </w:t>
-      </w:r>
-      <w:r>
-        <w:rPr>
-          <w:rStyle w:val="CodeChar"/>
-        </w:rPr>
-        <w:t xml:space="preserve">services/pokeapi.py</w:t>
-      </w:r>
-      <w:r>
-        <w:t xml:space="preserve"> (e os testes do cliente e as dependências).</w:t>
+        <w:t xml:space="preserve">Fica esperando para sempre: o programa congela.</w:t>
       </w:r>
     </w:p>
     <w:p>
@@ -23641,16 +23770,16 @@
         </w:numPr>
       </w:pPr>
       <w:r>
-        <w:t xml:space="preserve">O lugar que cria as dependências reais e as conecta: </w:t>
-      </w:r>
-      <w:r>
-        <w:rPr>
-          <w:rStyle w:val="CodeChar"/>
-        </w:rPr>
-        <w:t xml:space="preserve">main.py</w:t>
-      </w:r>
-      <w:r>
-        <w:t xml:space="preserve">.</w:t>
+        <w:t xml:space="preserve">Não; a resposta chega com </w:t>
+      </w:r>
+      <w:r>
+        <w:rPr>
+          <w:rStyle w:val="CodeChar"/>
+        </w:rPr>
+        <w:t xml:space="preserve">status_code == 404</w:t>
+      </w:r>
+      <w:r>
+        <w:t xml:space="preserve"> e o código precisa verificá-lo.</w:t>
       </w:r>
     </w:p>
     <w:p>
@@ -23662,88 +23791,16 @@
         </w:numPr>
       </w:pPr>
       <w:r>
-        <w:t xml:space="preserve">Para que uma nova tentativa funcione quando o problema passar.</w:t>
-      </w:r>
-    </w:p>
-    <w:p>
-      <w:pPr>
-        <w:pStyle w:val="ListParagraph"/>
-        <w:numPr>
-          <w:ilvl w:val="0"/>
-          <w:numId w:val="51"/>
-        </w:numPr>
-      </w:pPr>
-      <w:r>
-        <w:rPr>
-          <w:rStyle w:val="CodeChar"/>
-        </w:rPr>
-        <w:t xml:space="preserve">input</w:t>
-      </w:r>
-      <w:r>
-        <w:t xml:space="preserve"> e </w:t>
-      </w:r>
-      <w:r>
-        <w:rPr>
-          <w:rStyle w:val="CodeChar"/>
-        </w:rPr>
-        <w:t xml:space="preserve">print</w:t>
-      </w:r>
-      <w:r>
-        <w:t xml:space="preserve"> vão para </w:t>
-      </w:r>
-      <w:r>
-        <w:rPr>
-          <w:rStyle w:val="CodeChar"/>
-        </w:rPr>
-        <w:t xml:space="preserve">cli</w:t>
-      </w:r>
-      <w:r>
-        <w:t xml:space="preserve">; a requisição e o tratamento de status para </w:t>
-      </w:r>
-      <w:r>
-        <w:rPr>
-          <w:rStyle w:val="CodeChar"/>
-        </w:rPr>
-        <w:t xml:space="preserve">services</w:t>
-      </w:r>
-      <w:r>
-        <w:t xml:space="preserve">; o dicionário vira um modelo em </w:t>
-      </w:r>
-      <w:r>
-        <w:rPr>
-          <w:rStyle w:val="CodeChar"/>
-        </w:rPr>
-        <w:t xml:space="preserve">models</w:t>
-      </w:r>
-      <w:r>
-        <w:t xml:space="preserve">; a conversão </w:t>
-      </w:r>
-      <w:r>
-        <w:rPr>
-          <w:rStyle w:val="CodeChar"/>
-        </w:rPr>
-        <w:t xml:space="preserve">/ 10</w:t>
-      </w:r>
-      <w:r>
-        <w:t xml:space="preserve"> vira uma property; a formatação vai para </w:t>
-      </w:r>
-      <w:r>
-        <w:rPr>
-          <w:rStyle w:val="CodeChar"/>
-        </w:rPr>
-        <w:t xml:space="preserve">formatting.py</w:t>
-      </w:r>
-      <w:r>
-        <w:t xml:space="preserve">.</w:t>
-      </w:r>
-    </w:p>
-    <w:p>
-      <w:pPr/>
-      <w:r>
-        <w:rPr>
-          <w:b/>
-        </w:rPr>
-        <w:t xml:space="preserve">Módulo 17</w:t>
+        <w:t xml:space="preserve">Reaproveita conexões (mais rápido) e pode ser injetada (testes sem internet).</w:t>
+      </w:r>
+    </w:p>
+    <w:p>
+      <w:pPr/>
+      <w:r>
+        <w:rPr>
+          <w:b/>
+        </w:rPr>
+        <w:t xml:space="preserve">Módulo 16</w:t>
       </w:r>
     </w:p>
     <w:p>
@@ -23755,7 +23812,16 @@
         </w:numPr>
       </w:pPr>
       <w:r>
-        <w:t xml:space="preserve">Para separar resultado de erro: quem redireciona a saída para um arquivo ainda vê o erro na tela.</w:t>
+        <w:t xml:space="preserve">Apenas </w:t>
+      </w:r>
+      <w:r>
+        <w:rPr>
+          <w:rStyle w:val="CodeChar"/>
+        </w:rPr>
+        <w:t xml:space="preserve">services/pokeapi.py</w:t>
+      </w:r>
+      <w:r>
+        <w:t xml:space="preserve"> (e os testes do cliente e as dependências).</w:t>
       </w:r>
     </w:p>
     <w:p>
@@ -23767,7 +23833,16 @@
         </w:numPr>
       </w:pPr>
       <w:r>
-        <w:t xml:space="preserve">Envia "3" como se fosse digitado: o menu aparece e o programa sai.</w:t>
+        <w:t xml:space="preserve">O lugar que cria as dependências reais e as conecta: </w:t>
+      </w:r>
+      <w:r>
+        <w:rPr>
+          <w:rStyle w:val="CodeChar"/>
+        </w:rPr>
+        <w:t xml:space="preserve">main.py</w:t>
+      </w:r>
+      <w:r>
+        <w:t xml:space="preserve">.</w:t>
       </w:r>
     </w:p>
     <w:p>
@@ -23779,25 +23854,88 @@
         </w:numPr>
       </w:pPr>
       <w:r>
-        <w:t xml:space="preserve">Gera </w:t>
-      </w:r>
-      <w:r>
-        <w:rPr>
-          <w:rStyle w:val="CodeChar"/>
-        </w:rPr>
-        <w:t xml:space="preserve">--help</w:t>
-      </w:r>
-      <w:r>
-        <w:t xml:space="preserve">, valida tipos, mostra mensagens de uso e sai com código 2 em erro.</w:t>
-      </w:r>
-    </w:p>
-    <w:p>
-      <w:pPr/>
-      <w:r>
-        <w:rPr>
-          <w:b/>
-        </w:rPr>
-        <w:t xml:space="preserve">Módulo 18</w:t>
+        <w:t xml:space="preserve">Para que uma nova tentativa funcione quando o problema passar.</w:t>
+      </w:r>
+    </w:p>
+    <w:p>
+      <w:pPr>
+        <w:pStyle w:val="ListParagraph"/>
+        <w:numPr>
+          <w:ilvl w:val="0"/>
+          <w:numId w:val="52"/>
+        </w:numPr>
+      </w:pPr>
+      <w:r>
+        <w:rPr>
+          <w:rStyle w:val="CodeChar"/>
+        </w:rPr>
+        <w:t xml:space="preserve">input</w:t>
+      </w:r>
+      <w:r>
+        <w:t xml:space="preserve"> e </w:t>
+      </w:r>
+      <w:r>
+        <w:rPr>
+          <w:rStyle w:val="CodeChar"/>
+        </w:rPr>
+        <w:t xml:space="preserve">print</w:t>
+      </w:r>
+      <w:r>
+        <w:t xml:space="preserve"> vão para </w:t>
+      </w:r>
+      <w:r>
+        <w:rPr>
+          <w:rStyle w:val="CodeChar"/>
+        </w:rPr>
+        <w:t xml:space="preserve">cli</w:t>
+      </w:r>
+      <w:r>
+        <w:t xml:space="preserve">; a requisição e o tratamento de status para </w:t>
+      </w:r>
+      <w:r>
+        <w:rPr>
+          <w:rStyle w:val="CodeChar"/>
+        </w:rPr>
+        <w:t xml:space="preserve">services</w:t>
+      </w:r>
+      <w:r>
+        <w:t xml:space="preserve">; o dicionário vira um modelo em </w:t>
+      </w:r>
+      <w:r>
+        <w:rPr>
+          <w:rStyle w:val="CodeChar"/>
+        </w:rPr>
+        <w:t xml:space="preserve">models</w:t>
+      </w:r>
+      <w:r>
+        <w:t xml:space="preserve">; a conversão </w:t>
+      </w:r>
+      <w:r>
+        <w:rPr>
+          <w:rStyle w:val="CodeChar"/>
+        </w:rPr>
+        <w:t xml:space="preserve">/ 10</w:t>
+      </w:r>
+      <w:r>
+        <w:t xml:space="preserve"> vira uma property; a formatação vai para </w:t>
+      </w:r>
+      <w:r>
+        <w:rPr>
+          <w:rStyle w:val="CodeChar"/>
+        </w:rPr>
+        <w:t xml:space="preserve">formatting.py</w:t>
+      </w:r>
+      <w:r>
+        <w:t xml:space="preserve">.</w:t>
+      </w:r>
+    </w:p>
+    <w:p>
+      <w:pPr/>
+      <w:r>
+        <w:rPr>
+          <w:b/>
+        </w:rPr>
+        <w:t xml:space="preserve">Módulo 17</w:t>
       </w:r>
     </w:p>
     <w:p>
@@ -23809,22 +23947,7 @@
         </w:numPr>
       </w:pPr>
       <w:r>
-        <w:rPr>
-          <w:rStyle w:val="CodeChar"/>
-        </w:rPr>
-        <w:t xml:space="preserve">return_value</w:t>
-      </w:r>
-      <w:r>
-        <w:t xml:space="preserve"> é o que o mock devolve; </w:t>
-      </w:r>
-      <w:r>
-        <w:rPr>
-          <w:rStyle w:val="CodeChar"/>
-        </w:rPr>
-        <w:t xml:space="preserve">side_effect</w:t>
-      </w:r>
-      <w:r>
-        <w:t xml:space="preserve"> lança uma exceção ou devolve um item diferente a cada chamada.</w:t>
+        <w:t xml:space="preserve">Para separar resultado de erro: quem redireciona a saída para um arquivo ainda vê o erro na tela.</w:t>
       </w:r>
     </w:p>
     <w:p>
@@ -23836,7 +23959,7 @@
         </w:numPr>
       </w:pPr>
       <w:r>
-        <w:t xml:space="preserve">Cobertura só mede o que rodou, não se o resultado foi conferido nem se casos importantes foram testados.</w:t>
+        <w:t xml:space="preserve">Envia "3" como se fosse digitado: o menu aparece e o programa sai.</w:t>
       </w:r>
     </w:p>
     <w:p>
@@ -23848,28 +23971,25 @@
         </w:numPr>
       </w:pPr>
       <w:r>
-        <w:t xml:space="preserve">Dependem da internet: são lentos e podem falhar por motivos externos.</w:t>
-      </w:r>
-    </w:p>
-    <w:p>
-      <w:pPr>
-        <w:pStyle w:val="ListParagraph"/>
-        <w:numPr>
-          <w:ilvl w:val="0"/>
-          <w:numId w:val="53"/>
-        </w:numPr>
-      </w:pPr>
-      <w:r>
-        <w:t xml:space="preserve">Escreva um teste que falha (vermelho), o mínimo de código para passar (verde) e melhore o código mantendo os testes verdes (refatorar).</w:t>
-      </w:r>
-    </w:p>
-    <w:p>
-      <w:pPr/>
-      <w:r>
-        <w:rPr>
-          <w:b/>
-        </w:rPr>
-        <w:t xml:space="preserve">Módulo 19</w:t>
+        <w:t xml:space="preserve">Gera </w:t>
+      </w:r>
+      <w:r>
+        <w:rPr>
+          <w:rStyle w:val="CodeChar"/>
+        </w:rPr>
+        <w:t xml:space="preserve">--help</w:t>
+      </w:r>
+      <w:r>
+        <w:t xml:space="preserve">, valida tipos, mostra mensagens de uso e sai com código 2 em erro.</w:t>
+      </w:r>
+    </w:p>
+    <w:p>
+      <w:pPr/>
+      <w:r>
+        <w:rPr>
+          <w:b/>
+        </w:rPr>
+        <w:t xml:space="preserve">Módulo 18</w:t>
       </w:r>
     </w:p>
     <w:p>
@@ -23881,7 +24001,22 @@
         </w:numPr>
       </w:pPr>
       <w:r>
-        <w:t xml:space="preserve">O linter acha problemas; o formatador padroniza o visual.</w:t>
+        <w:rPr>
+          <w:rStyle w:val="CodeChar"/>
+        </w:rPr>
+        <w:t xml:space="preserve">return_value</w:t>
+      </w:r>
+      <w:r>
+        <w:t xml:space="preserve"> é o que o mock devolve; </w:t>
+      </w:r>
+      <w:r>
+        <w:rPr>
+          <w:rStyle w:val="CodeChar"/>
+        </w:rPr>
+        <w:t xml:space="preserve">side_effect</w:t>
+      </w:r>
+      <w:r>
+        <w:t xml:space="preserve"> lança uma exceção ou devolve um item diferente a cada chamada.</w:t>
       </w:r>
     </w:p>
     <w:p>
@@ -23893,16 +24028,7 @@
         </w:numPr>
       </w:pPr>
       <w:r>
-        <w:t xml:space="preserve">Em regex, </w:t>
-      </w:r>
-      <w:r>
-        <w:rPr>
-          <w:rStyle w:val="CodeChar"/>
-        </w:rPr>
-        <w:t xml:space="preserve">.</w:t>
-      </w:r>
-      <w:r>
-        <w:t xml:space="preserve"> significa "qualquer caractere", então o teste aceitaria textos diferentes do esperado.</w:t>
+        <w:t xml:space="preserve">Cobertura só mede o que rodou, não se o resultado foi conferido nem se casos importantes foram testados.</w:t>
       </w:r>
     </w:p>
     <w:p>
@@ -23914,25 +24040,28 @@
         </w:numPr>
       </w:pPr>
       <w:r>
-        <w:t xml:space="preserve">Fornece as anotações de tipo da biblioteca </w:t>
-      </w:r>
-      <w:r>
-        <w:rPr>
-          <w:rStyle w:val="CodeChar"/>
-        </w:rPr>
-        <w:t xml:space="preserve">requests</w:t>
-      </w:r>
-      <w:r>
-        <w:t xml:space="preserve"> para o mypy.</w:t>
-      </w:r>
-    </w:p>
-    <w:p>
-      <w:pPr/>
-      <w:r>
-        <w:rPr>
-          <w:b/>
-        </w:rPr>
-        <w:t xml:space="preserve">Módulo 20</w:t>
+        <w:t xml:space="preserve">Dependem da internet: são lentos e podem falhar por motivos externos.</w:t>
+      </w:r>
+    </w:p>
+    <w:p>
+      <w:pPr>
+        <w:pStyle w:val="ListParagraph"/>
+        <w:numPr>
+          <w:ilvl w:val="0"/>
+          <w:numId w:val="54"/>
+        </w:numPr>
+      </w:pPr>
+      <w:r>
+        <w:t xml:space="preserve">Escreva um teste que falha (vermelho), o mínimo de código para passar (verde) e melhore o código mantendo os testes verdes (refatorar).</w:t>
+      </w:r>
+    </w:p>
+    <w:p>
+      <w:pPr/>
+      <w:r>
+        <w:rPr>
+          <w:b/>
+        </w:rPr>
+        <w:t xml:space="preserve">Módulo 19</w:t>
       </w:r>
     </w:p>
     <w:p>
@@ -23944,22 +24073,7 @@
         </w:numPr>
       </w:pPr>
       <w:r>
-        <w:rPr>
-          <w:rStyle w:val="CodeChar"/>
-        </w:rPr>
-        <w:t xml:space="preserve">git add</w:t>
-      </w:r>
-      <w:r>
-        <w:t xml:space="preserve"> coloca mudanças no staging; </w:t>
-      </w:r>
-      <w:r>
-        <w:rPr>
-          <w:rStyle w:val="CodeChar"/>
-        </w:rPr>
-        <w:t xml:space="preserve">git commit</w:t>
-      </w:r>
-      <w:r>
-        <w:t xml:space="preserve"> grava o que está no staging no histórico.</w:t>
+        <w:t xml:space="preserve">O linter acha problemas; o formatador padroniza o visual.</w:t>
       </w:r>
     </w:p>
     <w:p>
@@ -23971,7 +24085,16 @@
         </w:numPr>
       </w:pPr>
       <w:r>
-        <w:t xml:space="preserve">"Fix BOM handling in piped menu input".</w:t>
+        <w:t xml:space="preserve">Em regex, </w:t>
+      </w:r>
+      <w:r>
+        <w:rPr>
+          <w:rStyle w:val="CodeChar"/>
+        </w:rPr>
+        <w:t xml:space="preserve">.</w:t>
+      </w:r>
+      <w:r>
+        <w:t xml:space="preserve"> significa "qualquer caractere", então o teste aceitaria textos diferentes do esperado.</w:t>
       </w:r>
     </w:p>
     <w:p>
@@ -23983,7 +24106,25 @@
         </w:numPr>
       </w:pPr>
       <w:r>
-        <w:t xml:space="preserve">Porque workflows executam código nos servidores do GitHub; é uma permissão de risco maior.</w:t>
+        <w:t xml:space="preserve">Fornece as anotações de tipo da biblioteca </w:t>
+      </w:r>
+      <w:r>
+        <w:rPr>
+          <w:rStyle w:val="CodeChar"/>
+        </w:rPr>
+        <w:t xml:space="preserve">requests</w:t>
+      </w:r>
+      <w:r>
+        <w:t xml:space="preserve"> para o mypy.</w:t>
+      </w:r>
+    </w:p>
+    <w:p>
+      <w:pPr/>
+      <w:r>
+        <w:rPr>
+          <w:b/>
+        </w:rPr>
+        <w:t xml:space="preserve">Módulo 20</w:t>
       </w:r>
     </w:p>
     <w:p>
@@ -23991,7 +24132,58 @@
         <w:pStyle w:val="ListParagraph"/>
         <w:numPr>
           <w:ilvl w:val="0"/>
-          <w:numId w:val="55"/>
+          <w:numId w:val="56"/>
+        </w:numPr>
+      </w:pPr>
+      <w:r>
+        <w:rPr>
+          <w:rStyle w:val="CodeChar"/>
+        </w:rPr>
+        <w:t xml:space="preserve">git add</w:t>
+      </w:r>
+      <w:r>
+        <w:t xml:space="preserve"> coloca mudanças no staging; </w:t>
+      </w:r>
+      <w:r>
+        <w:rPr>
+          <w:rStyle w:val="CodeChar"/>
+        </w:rPr>
+        <w:t xml:space="preserve">git commit</w:t>
+      </w:r>
+      <w:r>
+        <w:t xml:space="preserve"> grava o que está no staging no histórico.</w:t>
+      </w:r>
+    </w:p>
+    <w:p>
+      <w:pPr>
+        <w:pStyle w:val="ListParagraph"/>
+        <w:numPr>
+          <w:ilvl w:val="0"/>
+          <w:numId w:val="56"/>
+        </w:numPr>
+      </w:pPr>
+      <w:r>
+        <w:t xml:space="preserve">"Fix BOM handling in piped menu input".</w:t>
+      </w:r>
+    </w:p>
+    <w:p>
+      <w:pPr>
+        <w:pStyle w:val="ListParagraph"/>
+        <w:numPr>
+          <w:ilvl w:val="0"/>
+          <w:numId w:val="56"/>
+        </w:numPr>
+      </w:pPr>
+      <w:r>
+        <w:t xml:space="preserve">Porque workflows executam código nos servidores do GitHub; é uma permissão de risco maior.</w:t>
+      </w:r>
+    </w:p>
+    <w:p>
+      <w:pPr>
+        <w:pStyle w:val="ListParagraph"/>
+        <w:numPr>
+          <w:ilvl w:val="0"/>
+          <w:numId w:val="56"/>
         </w:numPr>
       </w:pPr>
       <w:r>
@@ -24339,16 +24531,16 @@
     </w:lvlOverride>
   </w:num>
   <w:num w:numId="33">
-    <w:abstractNumId w:val="0"/>
+    <w:abstractNumId w:val="1"/>
+    <w:lvlOverride w:ilvl="0">
+      <w:startOverride w:val="1"/>
+    </w:lvlOverride>
   </w:num>
   <w:num w:numId="34">
     <w:abstractNumId w:val="0"/>
   </w:num>
   <w:num w:numId="35">
-    <w:abstractNumId w:val="1"/>
-    <w:lvlOverride w:ilvl="0">
-      <w:startOverride w:val="1"/>
-    </w:lvlOverride>
+    <w:abstractNumId w:val="0"/>
   </w:num>
   <w:num w:numId="36">
     <w:abstractNumId w:val="1"/>
@@ -24465,6 +24657,12 @@
     </w:lvlOverride>
   </w:num>
   <w:num w:numId="55">
+    <w:abstractNumId w:val="1"/>
+    <w:lvlOverride w:ilvl="0">
+      <w:startOverride w:val="1"/>
+    </w:lvlOverride>
+  </w:num>
+  <w:num w:numId="56">
     <w:abstractNumId w:val="1"/>
     <w:lvlOverride w:ilvl="0">
       <w:startOverride w:val="1"/>

</xml_diff>